<commit_message>
Update Word compiler: add fenced code block parsing, dynamic page break fix, optimized headings spacing, recompile thesis DOCX and PDF
</commit_message>
<xml_diff>
--- a/graduation_thesis/BorsaNeuron_Graduation_Thesis.docx
+++ b/graduation_thesis/BorsaNeuron_Graduation_Thesis.docx
@@ -225,6 +225,7 @@
     <w:p>
       <w:pPr>
         <w:pStyle w:val="Heading2"/>
+        <w:spacing w:before="240" w:after="120"/>
         <w:jc w:val="left"/>
       </w:pPr>
       <w:r>
@@ -312,6 +313,7 @@
     <w:p>
       <w:pPr>
         <w:pStyle w:val="Heading2"/>
+        <w:spacing w:before="240" w:after="120"/>
         <w:jc w:val="left"/>
       </w:pPr>
       <w:r>
@@ -479,6 +481,7 @@
     <w:p>
       <w:pPr>
         <w:pStyle w:val="Heading2"/>
+        <w:spacing w:before="240" w:after="120"/>
         <w:jc w:val="left"/>
       </w:pPr>
       <w:r>
@@ -660,6 +663,7 @@
     <w:p>
       <w:pPr>
         <w:pStyle w:val="Heading2"/>
+        <w:spacing w:before="240" w:after="120"/>
         <w:jc w:val="left"/>
       </w:pPr>
       <w:r>
@@ -1078,13 +1082,9 @@
     </w:p>
     <w:p/>
     <w:p>
-      <w:r>
-        <w:br w:type="page"/>
-      </w:r>
-    </w:p>
-    <w:p>
       <w:pPr>
         <w:pStyle w:val="Heading1"/>
+        <w:spacing w:before="360" w:after="160"/>
         <w:jc w:val="left"/>
       </w:pPr>
       <w:r>
@@ -1339,6 +1339,7 @@
     <w:p>
       <w:pPr>
         <w:pStyle w:val="Heading1"/>
+        <w:spacing w:before="360" w:after="160"/>
         <w:jc w:val="left"/>
       </w:pPr>
       <w:r>
@@ -1355,6 +1356,7 @@
     <w:p>
       <w:pPr>
         <w:pStyle w:val="Heading2"/>
+        <w:spacing w:before="240" w:after="120"/>
         <w:jc w:val="left"/>
       </w:pPr>
       <w:r>
@@ -1447,6 +1449,7 @@
     <w:p>
       <w:pPr>
         <w:pStyle w:val="Heading2"/>
+        <w:spacing w:before="240" w:after="120"/>
         <w:jc w:val="left"/>
       </w:pPr>
       <w:r>
@@ -1489,23 +1492,332 @@
     <w:p/>
     <w:p>
       <w:pPr>
+        <w:spacing w:before="0" w:after="0"/>
+        <w:ind w:left="720" w:right="720"/>
+        <w:shd w:fill="F4F4F5"/>
+      </w:pPr>
+      <w:r>
+        <w:rPr>
+          <w:rFonts w:ascii="Courier New" w:hAnsi="Courier New"/>
+          <w:color w:val="3C3C3C"/>
+          <w:sz w:val="19"/>
+        </w:rPr>
+        <w:t>pandas&gt;=1.5.0</w:t>
+      </w:r>
+    </w:p>
+    <w:p>
+      <w:pPr>
+        <w:spacing w:before="0" w:after="0"/>
+        <w:ind w:left="720" w:right="720"/>
+        <w:shd w:fill="F4F4F5"/>
+      </w:pPr>
+      <w:r>
+        <w:rPr>
+          <w:rFonts w:ascii="Courier New" w:hAnsi="Courier New"/>
+          <w:color w:val="3C3C3C"/>
+          <w:sz w:val="19"/>
+        </w:rPr>
+        <w:t>numpy&gt;=1.22.0</w:t>
+      </w:r>
+    </w:p>
+    <w:p>
+      <w:pPr>
+        <w:spacing w:before="0" w:after="0"/>
+        <w:ind w:left="720" w:right="720"/>
+        <w:shd w:fill="F4F4F5"/>
+      </w:pPr>
+      <w:r>
+        <w:rPr>
+          <w:rFonts w:ascii="Courier New" w:hAnsi="Courier New"/>
+          <w:color w:val="3C3C3C"/>
+          <w:sz w:val="19"/>
+        </w:rPr>
+        <w:t>scikit-learn&gt;=1.1.0</w:t>
+      </w:r>
+    </w:p>
+    <w:p>
+      <w:pPr>
+        <w:spacing w:before="0" w:after="0"/>
+        <w:ind w:left="720" w:right="720"/>
+        <w:shd w:fill="F4F4F5"/>
+      </w:pPr>
+      <w:r>
+        <w:rPr>
+          <w:rFonts w:ascii="Courier New" w:hAnsi="Courier New"/>
+          <w:color w:val="3C3C3C"/>
+          <w:sz w:val="19"/>
+        </w:rPr>
+        <w:t>streamlit&gt;=1.22.0</w:t>
+      </w:r>
+    </w:p>
+    <w:p>
+      <w:pPr>
+        <w:spacing w:before="0" w:after="0"/>
+        <w:ind w:left="720" w:right="720"/>
+        <w:shd w:fill="F4F4F5"/>
+      </w:pPr>
+      <w:r>
+        <w:rPr>
+          <w:rFonts w:ascii="Courier New" w:hAnsi="Courier New"/>
+          <w:color w:val="3C3C3C"/>
+          <w:sz w:val="19"/>
+        </w:rPr>
+        <w:t>matplotlib&gt;=3.5.0</w:t>
+      </w:r>
+    </w:p>
+    <w:p>
+      <w:pPr>
+        <w:spacing w:before="0" w:after="0"/>
+        <w:ind w:left="720" w:right="720"/>
+        <w:shd w:fill="F4F4F5"/>
+      </w:pPr>
+      <w:r>
+        <w:rPr>
+          <w:rFonts w:ascii="Courier New" w:hAnsi="Courier New"/>
+          <w:color w:val="3C3C3C"/>
+          <w:sz w:val="19"/>
+        </w:rPr>
+        <w:t>seaborn&gt;=0.11.0</w:t>
+      </w:r>
+    </w:p>
+    <w:p>
+      <w:pPr>
+        <w:spacing w:before="0" w:after="0"/>
+        <w:ind w:left="720" w:right="720"/>
+        <w:shd w:fill="F4F4F5"/>
+      </w:pPr>
+      <w:r>
+        <w:rPr>
+          <w:rFonts w:ascii="Courier New" w:hAnsi="Courier New"/>
+          <w:color w:val="3C3C3C"/>
+          <w:sz w:val="19"/>
+        </w:rPr>
+        <w:t>joblib&gt;=1.1.0</w:t>
+      </w:r>
+    </w:p>
+    <w:p>
+      <w:pPr>
+        <w:spacing w:before="0" w:after="0"/>
+        <w:ind w:left="720" w:right="720"/>
+        <w:shd w:fill="F4F4F5"/>
+      </w:pPr>
+      <w:r>
+        <w:rPr>
+          <w:rFonts w:ascii="Courier New" w:hAnsi="Courier New"/>
+          <w:color w:val="3C3C3C"/>
+          <w:sz w:val="19"/>
+        </w:rPr>
+        <w:t>yfinance&gt;=0.2.0</w:t>
+      </w:r>
+    </w:p>
+    <w:p>
+      <w:pPr>
+        <w:spacing w:before="0" w:after="0"/>
+        <w:ind w:left="720" w:right="720"/>
+        <w:shd w:fill="F4F4F5"/>
+      </w:pPr>
+      <w:r>
+        <w:rPr>
+          <w:rFonts w:ascii="Courier New" w:hAnsi="Courier New"/>
+          <w:color w:val="3C3C3C"/>
+          <w:sz w:val="19"/>
+        </w:rPr>
+        <w:t>plotly&gt;=5.10.0</w:t>
+      </w:r>
+    </w:p>
+    <w:p>
+      <w:pPr>
+        <w:spacing w:before="0" w:after="0"/>
+        <w:ind w:left="720" w:right="720"/>
+        <w:shd w:fill="F4F4F5"/>
+      </w:pPr>
+      <w:r>
+        <w:rPr>
+          <w:rFonts w:ascii="Courier New" w:hAnsi="Courier New"/>
+          <w:color w:val="3C3C3C"/>
+          <w:sz w:val="19"/>
+        </w:rPr>
+        <w:t>xgboost&gt;=1.6.0</w:t>
+      </w:r>
+    </w:p>
+    <w:p/>
+    <w:p>
+      <w:pPr>
         <w:spacing w:line="360" w:lineRule="auto" w:after="160"/>
         <w:jc w:val="both"/>
       </w:pPr>
       <w:r>
         <w:rPr>
+          <w:rFonts w:ascii="Times New Roman" w:hAnsi="Times New Roman"/>
+          <w:sz w:val="24"/>
+        </w:rPr>
+        <w:t>The virtual environment setup and package installations are executed via the command terminal:</w:t>
+      </w:r>
+    </w:p>
+    <w:p/>
+    <w:p>
+      <w:pPr>
+        <w:spacing w:before="0" w:after="0"/>
+        <w:ind w:left="720" w:right="720"/>
+        <w:shd w:fill="F4F4F5"/>
+      </w:pPr>
+      <w:r>
+        <w:rPr>
           <w:rFonts w:ascii="Courier New" w:hAnsi="Courier New"/>
-          <w:sz w:val="21"/>
-        </w:rPr>
-      </w:r>
-      <w:r>
-        <w:rPr>
-          <w:rFonts w:ascii="Times New Roman" w:hAnsi="Times New Roman"/>
-          <w:sz w:val="24"/>
-        </w:rPr>
-        <w:t>text</w:t>
-      </w:r>
-    </w:p>
+          <w:color w:val="3C3C3C"/>
+          <w:sz w:val="19"/>
+        </w:rPr>
+        <w:t># Create virtual environment</w:t>
+      </w:r>
+    </w:p>
+    <w:p>
+      <w:pPr>
+        <w:spacing w:before="0" w:after="0"/>
+        <w:ind w:left="720" w:right="720"/>
+        <w:shd w:fill="F4F4F5"/>
+      </w:pPr>
+      <w:r>
+        <w:rPr>
+          <w:rFonts w:ascii="Courier New" w:hAnsi="Courier New"/>
+          <w:color w:val="3C3C3C"/>
+          <w:sz w:val="19"/>
+        </w:rPr>
+        <w:t>python -m venv borsaneuron_env</w:t>
+      </w:r>
+    </w:p>
+    <w:p>
+      <w:pPr>
+        <w:spacing w:before="0" w:after="0"/>
+        <w:ind w:left="720" w:right="720"/>
+        <w:shd w:fill="F4F4F5"/>
+      </w:pPr>
+      <w:r>
+        <w:rPr>
+          <w:rFonts w:ascii="Courier New" w:hAnsi="Courier New"/>
+          <w:color w:val="3C3C3C"/>
+          <w:sz w:val="19"/>
+        </w:rPr>
+      </w:r>
+    </w:p>
+    <w:p>
+      <w:pPr>
+        <w:spacing w:before="0" w:after="0"/>
+        <w:ind w:left="720" w:right="720"/>
+        <w:shd w:fill="F4F4F5"/>
+      </w:pPr>
+      <w:r>
+        <w:rPr>
+          <w:rFonts w:ascii="Courier New" w:hAnsi="Courier New"/>
+          <w:color w:val="3C3C3C"/>
+          <w:sz w:val="19"/>
+        </w:rPr>
+        <w:t># Activate virtual environment</w:t>
+      </w:r>
+    </w:p>
+    <w:p>
+      <w:pPr>
+        <w:spacing w:before="0" w:after="0"/>
+        <w:ind w:left="720" w:right="720"/>
+        <w:shd w:fill="F4F4F5"/>
+      </w:pPr>
+      <w:r>
+        <w:rPr>
+          <w:rFonts w:ascii="Courier New" w:hAnsi="Courier New"/>
+          <w:color w:val="3C3C3C"/>
+          <w:sz w:val="19"/>
+        </w:rPr>
+        <w:t>.\borsaneuron_env\Scripts\Activate.ps1</w:t>
+      </w:r>
+    </w:p>
+    <w:p>
+      <w:pPr>
+        <w:spacing w:before="0" w:after="0"/>
+        <w:ind w:left="720" w:right="720"/>
+        <w:shd w:fill="F4F4F5"/>
+      </w:pPr>
+      <w:r>
+        <w:rPr>
+          <w:rFonts w:ascii="Courier New" w:hAnsi="Courier New"/>
+          <w:color w:val="3C3C3C"/>
+          <w:sz w:val="19"/>
+        </w:rPr>
+      </w:r>
+    </w:p>
+    <w:p>
+      <w:pPr>
+        <w:spacing w:before="0" w:after="0"/>
+        <w:ind w:left="720" w:right="720"/>
+        <w:shd w:fill="F4F4F5"/>
+      </w:pPr>
+      <w:r>
+        <w:rPr>
+          <w:rFonts w:ascii="Courier New" w:hAnsi="Courier New"/>
+          <w:color w:val="3C3C3C"/>
+          <w:sz w:val="19"/>
+        </w:rPr>
+        <w:t># Upgrade pip manager</w:t>
+      </w:r>
+    </w:p>
+    <w:p>
+      <w:pPr>
+        <w:spacing w:before="0" w:after="0"/>
+        <w:ind w:left="720" w:right="720"/>
+        <w:shd w:fill="F4F4F5"/>
+      </w:pPr>
+      <w:r>
+        <w:rPr>
+          <w:rFonts w:ascii="Courier New" w:hAnsi="Courier New"/>
+          <w:color w:val="3C3C3C"/>
+          <w:sz w:val="19"/>
+        </w:rPr>
+        <w:t>python -m pip install --upgrade pip</w:t>
+      </w:r>
+    </w:p>
+    <w:p>
+      <w:pPr>
+        <w:spacing w:before="0" w:after="0"/>
+        <w:ind w:left="720" w:right="720"/>
+        <w:shd w:fill="F4F4F5"/>
+      </w:pPr>
+      <w:r>
+        <w:rPr>
+          <w:rFonts w:ascii="Courier New" w:hAnsi="Courier New"/>
+          <w:color w:val="3C3C3C"/>
+          <w:sz w:val="19"/>
+        </w:rPr>
+      </w:r>
+    </w:p>
+    <w:p>
+      <w:pPr>
+        <w:spacing w:before="0" w:after="0"/>
+        <w:ind w:left="720" w:right="720"/>
+        <w:shd w:fill="F4F4F5"/>
+      </w:pPr>
+      <w:r>
+        <w:rPr>
+          <w:rFonts w:ascii="Courier New" w:hAnsi="Courier New"/>
+          <w:color w:val="3C3C3C"/>
+          <w:sz w:val="19"/>
+        </w:rPr>
+        <w:t># Install project dependencies</w:t>
+      </w:r>
+    </w:p>
+    <w:p>
+      <w:pPr>
+        <w:spacing w:before="0" w:after="0"/>
+        <w:ind w:left="720" w:right="720"/>
+        <w:shd w:fill="F4F4F5"/>
+      </w:pPr>
+      <w:r>
+        <w:rPr>
+          <w:rFonts w:ascii="Courier New" w:hAnsi="Courier New"/>
+          <w:color w:val="3C3C3C"/>
+          <w:sz w:val="19"/>
+        </w:rPr>
+        <w:t>pip install -r requirements.txt</w:t>
+      </w:r>
+    </w:p>
+    <w:p/>
     <w:p>
       <w:pPr>
         <w:spacing w:line="360" w:lineRule="auto" w:after="160"/>
@@ -1516,173 +1828,11 @@
           <w:rFonts w:ascii="Times New Roman" w:hAnsi="Times New Roman"/>
           <w:sz w:val="24"/>
         </w:rPr>
-        <w:t>pandas&gt;=1.5.0</w:t>
-      </w:r>
-    </w:p>
-    <w:p>
-      <w:pPr>
-        <w:spacing w:line="360" w:lineRule="auto" w:after="160"/>
-        <w:jc w:val="both"/>
-      </w:pPr>
-      <w:r>
-        <w:rPr>
-          <w:rFonts w:ascii="Times New Roman" w:hAnsi="Times New Roman"/>
-          <w:sz w:val="24"/>
-        </w:rPr>
-        <w:t>numpy&gt;=1.22.0</w:t>
-      </w:r>
-    </w:p>
-    <w:p>
-      <w:pPr>
-        <w:spacing w:line="360" w:lineRule="auto" w:after="160"/>
-        <w:jc w:val="both"/>
-      </w:pPr>
-      <w:r>
-        <w:rPr>
-          <w:rFonts w:ascii="Times New Roman" w:hAnsi="Times New Roman"/>
-          <w:sz w:val="24"/>
-        </w:rPr>
-        <w:t>scikit-learn&gt;=1.1.0</w:t>
-      </w:r>
-    </w:p>
-    <w:p>
-      <w:pPr>
-        <w:spacing w:line="360" w:lineRule="auto" w:after="160"/>
-        <w:jc w:val="both"/>
-      </w:pPr>
-      <w:r>
-        <w:rPr>
-          <w:rFonts w:ascii="Times New Roman" w:hAnsi="Times New Roman"/>
-          <w:sz w:val="24"/>
-        </w:rPr>
-        <w:t>streamlit&gt;=1.22.0</w:t>
-      </w:r>
-    </w:p>
-    <w:p>
-      <w:pPr>
-        <w:spacing w:line="360" w:lineRule="auto" w:after="160"/>
-        <w:jc w:val="both"/>
-      </w:pPr>
-      <w:r>
-        <w:rPr>
-          <w:rFonts w:ascii="Times New Roman" w:hAnsi="Times New Roman"/>
-          <w:sz w:val="24"/>
-        </w:rPr>
-        <w:t>matplotlib&gt;=3.5.0</w:t>
-      </w:r>
-    </w:p>
-    <w:p>
-      <w:pPr>
-        <w:spacing w:line="360" w:lineRule="auto" w:after="160"/>
-        <w:jc w:val="both"/>
-      </w:pPr>
-      <w:r>
-        <w:rPr>
-          <w:rFonts w:ascii="Times New Roman" w:hAnsi="Times New Roman"/>
-          <w:sz w:val="24"/>
-        </w:rPr>
-        <w:t>seaborn&gt;=0.11.0</w:t>
-      </w:r>
-    </w:p>
-    <w:p>
-      <w:pPr>
-        <w:spacing w:line="360" w:lineRule="auto" w:after="160"/>
-        <w:jc w:val="both"/>
-      </w:pPr>
-      <w:r>
-        <w:rPr>
-          <w:rFonts w:ascii="Times New Roman" w:hAnsi="Times New Roman"/>
-          <w:sz w:val="24"/>
-        </w:rPr>
-        <w:t>joblib&gt;=1.1.0</w:t>
-      </w:r>
-    </w:p>
-    <w:p>
-      <w:pPr>
-        <w:spacing w:line="360" w:lineRule="auto" w:after="160"/>
-        <w:jc w:val="both"/>
-      </w:pPr>
-      <w:r>
-        <w:rPr>
-          <w:rFonts w:ascii="Times New Roman" w:hAnsi="Times New Roman"/>
-          <w:sz w:val="24"/>
-        </w:rPr>
-        <w:t>yfinance&gt;=0.2.0</w:t>
-      </w:r>
-    </w:p>
-    <w:p>
-      <w:pPr>
-        <w:spacing w:line="360" w:lineRule="auto" w:after="160"/>
-        <w:jc w:val="both"/>
-      </w:pPr>
-      <w:r>
-        <w:rPr>
-          <w:rFonts w:ascii="Times New Roman" w:hAnsi="Times New Roman"/>
-          <w:sz w:val="24"/>
-        </w:rPr>
-        <w:t>plotly&gt;=5.10.0</w:t>
-      </w:r>
-    </w:p>
-    <w:p>
-      <w:pPr>
-        <w:spacing w:line="360" w:lineRule="auto" w:after="160"/>
-        <w:jc w:val="both"/>
-      </w:pPr>
-      <w:r>
-        <w:rPr>
-          <w:rFonts w:ascii="Times New Roman" w:hAnsi="Times New Roman"/>
-          <w:sz w:val="24"/>
-        </w:rPr>
-        <w:t>xgboost&gt;=1.6.0</w:t>
-      </w:r>
-    </w:p>
-    <w:p>
-      <w:pPr>
-        <w:spacing w:line="360" w:lineRule="auto" w:after="160"/>
-        <w:jc w:val="both"/>
-      </w:pPr>
-      <w:r>
-        <w:rPr>
-          <w:rFonts w:ascii="Courier New" w:hAnsi="Courier New"/>
-          <w:sz w:val="21"/>
-        </w:rPr>
+        <w:t>---</w:t>
       </w:r>
     </w:p>
     <w:p/>
     <w:p>
-      <w:pPr>
-        <w:spacing w:line="360" w:lineRule="auto" w:after="160"/>
-        <w:jc w:val="both"/>
-      </w:pPr>
-      <w:r>
-        <w:rPr>
-          <w:rFonts w:ascii="Times New Roman" w:hAnsi="Times New Roman"/>
-          <w:sz w:val="24"/>
-        </w:rPr>
-        <w:t>The virtual environment setup and package installations are executed via the command terminal:</w:t>
-      </w:r>
-    </w:p>
-    <w:p/>
-    <w:p>
-      <w:pPr>
-        <w:spacing w:line="360" w:lineRule="auto" w:after="160"/>
-        <w:jc w:val="both"/>
-      </w:pPr>
-      <w:r>
-        <w:rPr>
-          <w:rFonts w:ascii="Courier New" w:hAnsi="Courier New"/>
-          <w:sz w:val="21"/>
-        </w:rPr>
-      </w:r>
-      <w:r>
-        <w:rPr>
-          <w:rFonts w:ascii="Times New Roman" w:hAnsi="Times New Roman"/>
-          <w:sz w:val="24"/>
-        </w:rPr>
-        <w:t>powershell</w:t>
-      </w:r>
-    </w:p>
-    <w:p>
       <w:r>
         <w:br w:type="page"/>
       </w:r>
@@ -1690,6 +1840,7 @@
     <w:p>
       <w:pPr>
         <w:pStyle w:val="Heading1"/>
+        <w:spacing w:before="360" w:after="160"/>
         <w:jc w:val="left"/>
       </w:pPr>
       <w:r>
@@ -1699,175 +1850,14 @@
           <w:color w:val="111111"/>
           <w:sz w:val="36"/>
         </w:rPr>
-        <w:t>Create virtual environment</w:t>
-      </w:r>
-    </w:p>
-    <w:p>
-      <w:pPr>
-        <w:spacing w:line="360" w:lineRule="auto" w:after="160"/>
-        <w:jc w:val="both"/>
-      </w:pPr>
-      <w:r>
-        <w:rPr>
-          <w:rFonts w:ascii="Times New Roman" w:hAnsi="Times New Roman"/>
-          <w:sz w:val="24"/>
-        </w:rPr>
-        <w:t>python -m venv borsaneuron_env</w:t>
+        <w:t>3. DATASET &amp; PREPROCESSING</w:t>
       </w:r>
     </w:p>
     <w:p/>
     <w:p>
-      <w:r>
-        <w:br w:type="page"/>
-      </w:r>
-    </w:p>
-    <w:p>
-      <w:pPr>
-        <w:pStyle w:val="Heading1"/>
-        <w:jc w:val="left"/>
-      </w:pPr>
-      <w:r>
-        <w:rPr>
-          <w:rFonts w:ascii="Times New Roman" w:hAnsi="Times New Roman"/>
-          <w:b/>
-          <w:color w:val="111111"/>
-          <w:sz w:val="36"/>
-        </w:rPr>
-        <w:t>Activate virtual environment</w:t>
-      </w:r>
-    </w:p>
-    <w:p>
-      <w:pPr>
-        <w:spacing w:line="360" w:lineRule="auto" w:after="160"/>
-        <w:jc w:val="both"/>
-      </w:pPr>
-      <w:r>
-        <w:rPr>
-          <w:rFonts w:ascii="Times New Roman" w:hAnsi="Times New Roman"/>
-          <w:sz w:val="24"/>
-        </w:rPr>
-        <w:t>.\borsaneuron_env\Scripts\Activate.ps1</w:t>
-      </w:r>
-    </w:p>
-    <w:p/>
-    <w:p>
-      <w:r>
-        <w:br w:type="page"/>
-      </w:r>
-    </w:p>
-    <w:p>
-      <w:pPr>
-        <w:pStyle w:val="Heading1"/>
-        <w:jc w:val="left"/>
-      </w:pPr>
-      <w:r>
-        <w:rPr>
-          <w:rFonts w:ascii="Times New Roman" w:hAnsi="Times New Roman"/>
-          <w:b/>
-          <w:color w:val="111111"/>
-          <w:sz w:val="36"/>
-        </w:rPr>
-        <w:t>Upgrade pip manager</w:t>
-      </w:r>
-    </w:p>
-    <w:p>
-      <w:pPr>
-        <w:spacing w:line="360" w:lineRule="auto" w:after="160"/>
-        <w:jc w:val="both"/>
-      </w:pPr>
-      <w:r>
-        <w:rPr>
-          <w:rFonts w:ascii="Times New Roman" w:hAnsi="Times New Roman"/>
-          <w:sz w:val="24"/>
-        </w:rPr>
-        <w:t>python -m pip install --upgrade pip</w:t>
-      </w:r>
-    </w:p>
-    <w:p/>
-    <w:p>
-      <w:r>
-        <w:br w:type="page"/>
-      </w:r>
-    </w:p>
-    <w:p>
-      <w:pPr>
-        <w:pStyle w:val="Heading1"/>
-        <w:jc w:val="left"/>
-      </w:pPr>
-      <w:r>
-        <w:rPr>
-          <w:rFonts w:ascii="Times New Roman" w:hAnsi="Times New Roman"/>
-          <w:b/>
-          <w:color w:val="111111"/>
-          <w:sz w:val="36"/>
-        </w:rPr>
-        <w:t>Install project dependencies</w:t>
-      </w:r>
-    </w:p>
-    <w:p>
-      <w:pPr>
-        <w:spacing w:line="360" w:lineRule="auto" w:after="160"/>
-        <w:jc w:val="both"/>
-      </w:pPr>
-      <w:r>
-        <w:rPr>
-          <w:rFonts w:ascii="Times New Roman" w:hAnsi="Times New Roman"/>
-          <w:sz w:val="24"/>
-        </w:rPr>
-        <w:t>pip install -r requirements.txt</w:t>
-      </w:r>
-    </w:p>
-    <w:p>
-      <w:pPr>
-        <w:spacing w:line="360" w:lineRule="auto" w:after="160"/>
-        <w:jc w:val="both"/>
-      </w:pPr>
-      <w:r>
-        <w:rPr>
-          <w:rFonts w:ascii="Courier New" w:hAnsi="Courier New"/>
-          <w:sz w:val="21"/>
-        </w:rPr>
-      </w:r>
-    </w:p>
-    <w:p/>
-    <w:p>
-      <w:pPr>
-        <w:spacing w:line="360" w:lineRule="auto" w:after="160"/>
-        <w:jc w:val="both"/>
-      </w:pPr>
-      <w:r>
-        <w:rPr>
-          <w:rFonts w:ascii="Times New Roman" w:hAnsi="Times New Roman"/>
-          <w:sz w:val="24"/>
-        </w:rPr>
-        <w:t>---</w:t>
-      </w:r>
-    </w:p>
-    <w:p/>
-    <w:p>
-      <w:r>
-        <w:br w:type="page"/>
-      </w:r>
-    </w:p>
-    <w:p>
-      <w:pPr>
-        <w:pStyle w:val="Heading1"/>
-        <w:jc w:val="left"/>
-      </w:pPr>
-      <w:r>
-        <w:rPr>
-          <w:rFonts w:ascii="Times New Roman" w:hAnsi="Times New Roman"/>
-          <w:b/>
-          <w:color w:val="111111"/>
-          <w:sz w:val="36"/>
-        </w:rPr>
-        <w:t>3. DATASET &amp; PREPROCESSING</w:t>
-      </w:r>
-    </w:p>
-    <w:p/>
-    <w:p>
       <w:pPr>
         <w:pStyle w:val="Heading2"/>
+        <w:spacing w:before="240" w:after="120"/>
         <w:jc w:val="left"/>
       </w:pPr>
       <w:r>
@@ -2503,6 +2493,7 @@
     <w:p>
       <w:pPr>
         <w:pStyle w:val="Heading2"/>
+        <w:spacing w:before="240" w:after="120"/>
         <w:jc w:val="left"/>
       </w:pPr>
       <w:r>
@@ -2642,6 +2633,7 @@
     <w:p>
       <w:pPr>
         <w:pStyle w:val="Heading2"/>
+        <w:spacing w:before="240" w:after="120"/>
         <w:jc w:val="left"/>
       </w:pPr>
       <w:r>
@@ -2987,6 +2979,7 @@
     <w:p>
       <w:pPr>
         <w:pStyle w:val="Heading1"/>
+        <w:spacing w:before="360" w:after="160"/>
         <w:jc w:val="left"/>
       </w:pPr>
       <w:r>
@@ -3003,6 +2996,7 @@
     <w:p>
       <w:pPr>
         <w:pStyle w:val="Heading2"/>
+        <w:spacing w:before="240" w:after="120"/>
         <w:jc w:val="left"/>
       </w:pPr>
       <w:r>
@@ -3213,6 +3207,7 @@
     <w:p>
       <w:pPr>
         <w:pStyle w:val="Heading2"/>
+        <w:spacing w:before="240" w:after="120"/>
         <w:jc w:val="left"/>
       </w:pPr>
       <w:r>
@@ -3380,6 +3375,7 @@
     <w:p>
       <w:pPr>
         <w:pStyle w:val="Heading2"/>
+        <w:spacing w:before="240" w:after="120"/>
         <w:jc w:val="left"/>
       </w:pPr>
       <w:r>
@@ -3577,6 +3573,7 @@
     <w:p>
       <w:pPr>
         <w:pStyle w:val="Heading2"/>
+        <w:spacing w:before="240" w:after="120"/>
         <w:jc w:val="left"/>
       </w:pPr>
       <w:r>
@@ -4702,6 +4699,7 @@
     <w:p>
       <w:pPr>
         <w:pStyle w:val="Heading1"/>
+        <w:spacing w:before="360" w:after="160"/>
         <w:jc w:val="left"/>
       </w:pPr>
       <w:r>
@@ -4718,6 +4716,7 @@
     <w:p>
       <w:pPr>
         <w:pStyle w:val="Heading2"/>
+        <w:spacing w:before="240" w:after="120"/>
         <w:jc w:val="left"/>
       </w:pPr>
       <w:r>
@@ -4927,6 +4926,7 @@
     <w:p>
       <w:pPr>
         <w:pStyle w:val="Heading2"/>
+        <w:spacing w:before="240" w:after="120"/>
         <w:jc w:val="left"/>
       </w:pPr>
       <w:r>
@@ -4969,226 +4969,210 @@
     <w:p/>
     <w:p>
       <w:pPr>
-        <w:spacing w:line="360" w:lineRule="auto" w:after="160"/>
-        <w:jc w:val="both"/>
+        <w:spacing w:before="0" w:after="0"/>
+        <w:ind w:left="720" w:right="720"/>
+        <w:shd w:fill="F4F4F5"/>
       </w:pPr>
       <w:r>
         <w:rPr>
           <w:rFonts w:ascii="Courier New" w:hAnsi="Courier New"/>
-          <w:sz w:val="21"/>
-        </w:rPr>
-      </w:r>
-      <w:r>
-        <w:rPr>
-          <w:rFonts w:ascii="Times New Roman" w:hAnsi="Times New Roman"/>
-          <w:sz w:val="24"/>
-        </w:rPr>
-        <w:t>python</w:t>
-      </w:r>
-    </w:p>
-    <w:p>
-      <w:r>
-        <w:br w:type="page"/>
-      </w:r>
-    </w:p>
-    <w:p>
-      <w:pPr>
-        <w:pStyle w:val="Heading1"/>
-        <w:jc w:val="left"/>
-      </w:pPr>
-      <w:r>
-        <w:rPr>
-          <w:rFonts w:ascii="Times New Roman" w:hAnsi="Times New Roman"/>
-          <w:b/>
-          <w:color w:val="111111"/>
-          <w:sz w:val="36"/>
-        </w:rPr>
-        <w:t>Real-time loading and inference</w:t>
-      </w:r>
-    </w:p>
-    <w:p>
-      <w:pPr>
-        <w:spacing w:line="360" w:lineRule="auto" w:after="160"/>
-        <w:jc w:val="both"/>
-      </w:pPr>
-      <w:r>
-        <w:rPr>
-          <w:rFonts w:ascii="Times New Roman" w:hAnsi="Times New Roman"/>
-          <w:sz w:val="24"/>
+          <w:color w:val="3C3C3C"/>
+          <w:sz w:val="19"/>
+        </w:rPr>
+        <w:t># Real-time loading and inference</w:t>
+      </w:r>
+    </w:p>
+    <w:p>
+      <w:pPr>
+        <w:spacing w:before="0" w:after="0"/>
+        <w:ind w:left="720" w:right="720"/>
+        <w:shd w:fill="F4F4F5"/>
+      </w:pPr>
+      <w:r>
+        <w:rPr>
+          <w:rFonts w:ascii="Courier New" w:hAnsi="Courier New"/>
+          <w:color w:val="3C3C3C"/>
+          <w:sz w:val="19"/>
         </w:rPr>
         <w:t>import yfinance as yf</w:t>
       </w:r>
     </w:p>
     <w:p>
       <w:pPr>
-        <w:spacing w:line="360" w:lineRule="auto" w:after="160"/>
-        <w:jc w:val="both"/>
-      </w:pPr>
-      <w:r>
-        <w:rPr>
-          <w:rFonts w:ascii="Times New Roman" w:hAnsi="Times New Roman"/>
-          <w:sz w:val="24"/>
+        <w:spacing w:before="0" w:after="0"/>
+        <w:ind w:left="720" w:right="720"/>
+        <w:shd w:fill="F4F4F5"/>
+      </w:pPr>
+      <w:r>
+        <w:rPr>
+          <w:rFonts w:ascii="Courier New" w:hAnsi="Courier New"/>
+          <w:color w:val="3C3C3C"/>
+          <w:sz w:val="19"/>
         </w:rPr>
         <w:t>import joblib</w:t>
       </w:r>
     </w:p>
-    <w:p/>
-    <w:p>
-      <w:pPr>
-        <w:spacing w:line="360" w:lineRule="auto" w:after="160"/>
-        <w:jc w:val="both"/>
-      </w:pPr>
-      <w:r>
-        <w:rPr>
-          <w:rFonts w:ascii="Times New Roman" w:hAnsi="Times New Roman"/>
-          <w:sz w:val="24"/>
+    <w:p>
+      <w:pPr>
+        <w:spacing w:before="0" w:after="0"/>
+        <w:ind w:left="720" w:right="720"/>
+        <w:shd w:fill="F4F4F5"/>
+      </w:pPr>
+      <w:r>
+        <w:rPr>
+          <w:rFonts w:ascii="Courier New" w:hAnsi="Courier New"/>
+          <w:color w:val="3C3C3C"/>
+          <w:sz w:val="19"/>
+        </w:rPr>
+      </w:r>
+    </w:p>
+    <w:p>
+      <w:pPr>
+        <w:spacing w:before="0" w:after="0"/>
+        <w:ind w:left="720" w:right="720"/>
+        <w:shd w:fill="F4F4F5"/>
+      </w:pPr>
+      <w:r>
+        <w:rPr>
+          <w:rFonts w:ascii="Courier New" w:hAnsi="Courier New"/>
+          <w:color w:val="3C3C3C"/>
+          <w:sz w:val="19"/>
         </w:rPr>
         <w:t>scaler = joblib.load("best_scaler_acm465.joblib")</w:t>
       </w:r>
     </w:p>
     <w:p>
       <w:pPr>
-        <w:spacing w:line="360" w:lineRule="auto" w:after="160"/>
-        <w:jc w:val="both"/>
-      </w:pPr>
-      <w:r>
-        <w:rPr>
-          <w:rFonts w:ascii="Times New Roman" w:hAnsi="Times New Roman"/>
-          <w:sz w:val="24"/>
+        <w:spacing w:before="0" w:after="0"/>
+        <w:ind w:left="720" w:right="720"/>
+        <w:shd w:fill="F4F4F5"/>
+      </w:pPr>
+      <w:r>
+        <w:rPr>
+          <w:rFonts w:ascii="Courier New" w:hAnsi="Courier New"/>
+          <w:color w:val="3C3C3C"/>
+          <w:sz w:val="19"/>
         </w:rPr>
         <w:t>model = joblib.load("best_model_acm465.joblib")</w:t>
       </w:r>
     </w:p>
-    <w:p/>
-    <w:p>
-      <w:pPr>
-        <w:spacing w:line="360" w:lineRule="auto" w:after="160"/>
-        <w:jc w:val="both"/>
-      </w:pPr>
-      <w:r>
-        <w:rPr>
-          <w:rFonts w:ascii="Times New Roman" w:hAnsi="Times New Roman"/>
-          <w:sz w:val="24"/>
+    <w:p>
+      <w:pPr>
+        <w:spacing w:before="0" w:after="0"/>
+        <w:ind w:left="720" w:right="720"/>
+        <w:shd w:fill="F4F4F5"/>
+      </w:pPr>
+      <w:r>
+        <w:rPr>
+          <w:rFonts w:ascii="Courier New" w:hAnsi="Courier New"/>
+          <w:color w:val="3C3C3C"/>
+          <w:sz w:val="19"/>
+        </w:rPr>
+      </w:r>
+    </w:p>
+    <w:p>
+      <w:pPr>
+        <w:spacing w:before="0" w:after="0"/>
+        <w:ind w:left="720" w:right="720"/>
+        <w:shd w:fill="F4F4F5"/>
+      </w:pPr>
+      <w:r>
+        <w:rPr>
+          <w:rFonts w:ascii="Courier New" w:hAnsi="Courier New"/>
+          <w:color w:val="3C3C3C"/>
+          <w:sz w:val="19"/>
         </w:rPr>
         <w:t>def get_live_forecast(ticker):</w:t>
       </w:r>
     </w:p>
     <w:p>
       <w:pPr>
-        <w:spacing w:line="360" w:lineRule="auto" w:after="160"/>
-        <w:jc w:val="both"/>
-      </w:pPr>
-      <w:r>
-        <w:rPr>
-          <w:rFonts w:ascii="Times New Roman" w:hAnsi="Times New Roman"/>
-          <w:sz w:val="24"/>
-        </w:rPr>
-        <w:t>df_live = yf.download(ticker, period="1y", interval="1d")</w:t>
-      </w:r>
-    </w:p>
-    <w:p>
-      <w:pPr>
-        <w:spacing w:line="360" w:lineRule="auto" w:after="160"/>
-        <w:jc w:val="both"/>
-      </w:pPr>
-      <w:r>
-        <w:rPr>
-          <w:rFonts w:ascii="Times New Roman" w:hAnsi="Times New Roman"/>
-          <w:sz w:val="24"/>
-        </w:rPr>
-        <w:t>feature_vector = compute_technical_vector(df_live)</w:t>
-      </w:r>
-    </w:p>
-    <w:p>
-      <w:pPr>
-        <w:spacing w:line="360" w:lineRule="auto" w:after="160"/>
-        <w:jc w:val="both"/>
-      </w:pPr>
-      <w:r>
-        <w:rPr>
-          <w:rFonts w:ascii="Times New Roman" w:hAnsi="Times New Roman"/>
-          <w:sz w:val="24"/>
-        </w:rPr>
-        <w:t>scaled_vector = scaler.transform(</w:t>
-      </w:r>
-      <w:r>
-        <w:rPr>
-          <w:rFonts w:ascii="Times New Roman" w:hAnsi="Times New Roman"/>
-          <w:sz w:val="24"/>
-        </w:rPr>
-        <w:t>feature_vector])</w:t>
-      </w:r>
-    </w:p>
-    <w:p>
-      <w:pPr>
-        <w:spacing w:line="360" w:lineRule="auto" w:after="160"/>
-        <w:jc w:val="both"/>
-      </w:pPr>
-      <w:r>
-        <w:rPr>
-          <w:rFonts w:ascii="Times New Roman" w:hAnsi="Times New Roman"/>
-          <w:sz w:val="24"/>
-        </w:rPr>
-        <w:t>prediction = model.predict(scaled_vector)</w:t>
-      </w:r>
-      <w:r>
-        <w:rPr>
-          <w:rFonts w:ascii="Times New Roman" w:hAnsi="Times New Roman"/>
-          <w:sz w:val="24"/>
-        </w:rPr>
-        <w:t>0]</w:t>
-      </w:r>
-    </w:p>
-    <w:p>
-      <w:pPr>
-        <w:spacing w:line="360" w:lineRule="auto" w:after="160"/>
-        <w:jc w:val="both"/>
-      </w:pPr>
-      <w:r>
-        <w:rPr>
-          <w:rFonts w:ascii="Times New Roman" w:hAnsi="Times New Roman"/>
-          <w:sz w:val="24"/>
-        </w:rPr>
-        <w:t>probability = model.predict_proba(scaled_vector)</w:t>
-      </w:r>
-      <w:r>
-        <w:rPr>
-          <w:rFonts w:ascii="Times New Roman" w:hAnsi="Times New Roman"/>
-          <w:sz w:val="24"/>
-        </w:rPr>
-        <w:t>0]</w:t>
-      </w:r>
-      <w:r>
-        <w:rPr>
-          <w:rFonts w:ascii="Times New Roman" w:hAnsi="Times New Roman"/>
-          <w:sz w:val="24"/>
-        </w:rPr>
-        <w:t>1]</w:t>
-      </w:r>
-    </w:p>
-    <w:p>
-      <w:pPr>
-        <w:spacing w:line="360" w:lineRule="auto" w:after="160"/>
-        <w:jc w:val="both"/>
-      </w:pPr>
-      <w:r>
-        <w:rPr>
-          <w:rFonts w:ascii="Times New Roman" w:hAnsi="Times New Roman"/>
-          <w:sz w:val="24"/>
-        </w:rPr>
-        <w:t>return prediction, probability</w:t>
-      </w:r>
-    </w:p>
-    <w:p>
-      <w:pPr>
-        <w:spacing w:line="360" w:lineRule="auto" w:after="160"/>
-        <w:jc w:val="both"/>
+        <w:spacing w:before="0" w:after="0"/>
+        <w:ind w:left="720" w:right="720"/>
+        <w:shd w:fill="F4F4F5"/>
       </w:pPr>
       <w:r>
         <w:rPr>
           <w:rFonts w:ascii="Courier New" w:hAnsi="Courier New"/>
-          <w:sz w:val="21"/>
-        </w:rPr>
+          <w:color w:val="3C3C3C"/>
+          <w:sz w:val="19"/>
+        </w:rPr>
+        <w:t xml:space="preserve">    df_live = yf.download(ticker, period="1y", interval="1d")</w:t>
+      </w:r>
+    </w:p>
+    <w:p>
+      <w:pPr>
+        <w:spacing w:before="0" w:after="0"/>
+        <w:ind w:left="720" w:right="720"/>
+        <w:shd w:fill="F4F4F5"/>
+      </w:pPr>
+      <w:r>
+        <w:rPr>
+          <w:rFonts w:ascii="Courier New" w:hAnsi="Courier New"/>
+          <w:color w:val="3C3C3C"/>
+          <w:sz w:val="19"/>
+        </w:rPr>
+        <w:t xml:space="preserve">    feature_vector = compute_technical_vector(df_live)</w:t>
+      </w:r>
+    </w:p>
+    <w:p>
+      <w:pPr>
+        <w:spacing w:before="0" w:after="0"/>
+        <w:ind w:left="720" w:right="720"/>
+        <w:shd w:fill="F4F4F5"/>
+      </w:pPr>
+      <w:r>
+        <w:rPr>
+          <w:rFonts w:ascii="Courier New" w:hAnsi="Courier New"/>
+          <w:color w:val="3C3C3C"/>
+          <w:sz w:val="19"/>
+        </w:rPr>
+        <w:t xml:space="preserve">    scaled_vector = scaler.transform([feature_vector])</w:t>
+      </w:r>
+    </w:p>
+    <w:p>
+      <w:pPr>
+        <w:spacing w:before="0" w:after="0"/>
+        <w:ind w:left="720" w:right="720"/>
+        <w:shd w:fill="F4F4F5"/>
+      </w:pPr>
+      <w:r>
+        <w:rPr>
+          <w:rFonts w:ascii="Courier New" w:hAnsi="Courier New"/>
+          <w:color w:val="3C3C3C"/>
+          <w:sz w:val="19"/>
+        </w:rPr>
+        <w:t xml:space="preserve">    prediction = model.predict(scaled_vector)[0]</w:t>
+      </w:r>
+    </w:p>
+    <w:p>
+      <w:pPr>
+        <w:spacing w:before="0" w:after="0"/>
+        <w:ind w:left="720" w:right="720"/>
+        <w:shd w:fill="F4F4F5"/>
+      </w:pPr>
+      <w:r>
+        <w:rPr>
+          <w:rFonts w:ascii="Courier New" w:hAnsi="Courier New"/>
+          <w:color w:val="3C3C3C"/>
+          <w:sz w:val="19"/>
+        </w:rPr>
+        <w:t xml:space="preserve">    probability = model.predict_proba(scaled_vector)[0][1]</w:t>
+      </w:r>
+    </w:p>
+    <w:p>
+      <w:pPr>
+        <w:spacing w:before="0" w:after="0"/>
+        <w:ind w:left="720" w:right="720"/>
+        <w:shd w:fill="F4F4F5"/>
+      </w:pPr>
+      <w:r>
+        <w:rPr>
+          <w:rFonts w:ascii="Courier New" w:hAnsi="Courier New"/>
+          <w:color w:val="3C3C3C"/>
+          <w:sz w:val="19"/>
+        </w:rPr>
+        <w:t xml:space="preserve">    return prediction, probability</w:t>
       </w:r>
     </w:p>
     <w:p/>
@@ -5277,6 +5261,7 @@
     <w:p>
       <w:pPr>
         <w:pStyle w:val="Heading2"/>
+        <w:spacing w:before="240" w:after="120"/>
         <w:jc w:val="left"/>
       </w:pPr>
       <w:r>
@@ -5364,6 +5349,7 @@
     <w:p>
       <w:pPr>
         <w:pStyle w:val="Heading2"/>
+        <w:spacing w:before="240" w:after="120"/>
         <w:jc w:val="left"/>
       </w:pPr>
       <w:r>
@@ -5393,6 +5379,7 @@
     <w:p>
       <w:pPr>
         <w:pStyle w:val="Heading2"/>
+        <w:spacing w:before="240" w:after="120"/>
         <w:jc w:val="left"/>
       </w:pPr>
       <w:r>
@@ -5422,6 +5409,7 @@
     <w:p>
       <w:pPr>
         <w:pStyle w:val="Heading2"/>
+        <w:spacing w:before="240" w:after="120"/>
         <w:jc w:val="left"/>
       </w:pPr>
       <w:r>
@@ -5757,6 +5745,7 @@
     <w:p>
       <w:pPr>
         <w:pStyle w:val="Heading1"/>
+        <w:spacing w:before="360" w:after="160"/>
         <w:jc w:val="left"/>
       </w:pPr>
       <w:r>
@@ -5787,6 +5776,7 @@
     <w:p>
       <w:pPr>
         <w:pStyle w:val="Heading2"/>
+        <w:spacing w:before="240" w:after="120"/>
         <w:jc w:val="left"/>
       </w:pPr>
       <w:r>
@@ -5829,254 +5819,249 @@
     <w:p/>
     <w:p>
       <w:pPr>
-        <w:spacing w:line="360" w:lineRule="auto" w:after="160"/>
-        <w:jc w:val="both"/>
+        <w:spacing w:before="0" w:after="0"/>
+        <w:ind w:left="720" w:right="720"/>
+        <w:shd w:fill="F4F4F5"/>
       </w:pPr>
       <w:r>
         <w:rPr>
           <w:rFonts w:ascii="Courier New" w:hAnsi="Courier New"/>
-          <w:sz w:val="21"/>
-        </w:rPr>
-      </w:r>
-      <w:r>
-        <w:rPr>
-          <w:rFonts w:ascii="Times New Roman" w:hAnsi="Times New Roman"/>
-          <w:sz w:val="24"/>
-        </w:rPr>
-        <w:t>dockerfile</w:t>
-      </w:r>
-    </w:p>
-    <w:p>
-      <w:pPr>
-        <w:spacing w:line="360" w:lineRule="auto" w:after="160"/>
-        <w:jc w:val="both"/>
-      </w:pPr>
-      <w:r>
-        <w:rPr>
-          <w:rFonts w:ascii="Times New Roman" w:hAnsi="Times New Roman"/>
-          <w:sz w:val="24"/>
+          <w:color w:val="3C3C3C"/>
+          <w:sz w:val="19"/>
         </w:rPr>
         <w:t>FROM python:3.9-slim</w:t>
       </w:r>
     </w:p>
     <w:p>
       <w:pPr>
-        <w:spacing w:line="360" w:lineRule="auto" w:after="160"/>
-        <w:jc w:val="both"/>
-      </w:pPr>
-      <w:r>
-        <w:rPr>
-          <w:rFonts w:ascii="Times New Roman" w:hAnsi="Times New Roman"/>
-          <w:sz w:val="24"/>
+        <w:spacing w:before="0" w:after="0"/>
+        <w:ind w:left="720" w:right="720"/>
+        <w:shd w:fill="F4F4F5"/>
+      </w:pPr>
+      <w:r>
+        <w:rPr>
+          <w:rFonts w:ascii="Courier New" w:hAnsi="Courier New"/>
+          <w:color w:val="3C3C3C"/>
+          <w:sz w:val="19"/>
         </w:rPr>
         <w:t>ENV PYTHONDONTWRITEBYTECODE=1</w:t>
       </w:r>
     </w:p>
     <w:p>
       <w:pPr>
-        <w:spacing w:line="360" w:lineRule="auto" w:after="160"/>
-        <w:jc w:val="both"/>
-      </w:pPr>
-      <w:r>
-        <w:rPr>
-          <w:rFonts w:ascii="Times New Roman" w:hAnsi="Times New Roman"/>
-          <w:sz w:val="24"/>
+        <w:spacing w:before="0" w:after="0"/>
+        <w:ind w:left="720" w:right="720"/>
+        <w:shd w:fill="F4F4F5"/>
+      </w:pPr>
+      <w:r>
+        <w:rPr>
+          <w:rFonts w:ascii="Courier New" w:hAnsi="Courier New"/>
+          <w:color w:val="3C3C3C"/>
+          <w:sz w:val="19"/>
         </w:rPr>
         <w:t>ENV PYTHONUNBUFFERED=1</w:t>
       </w:r>
     </w:p>
     <w:p>
       <w:pPr>
-        <w:spacing w:line="360" w:lineRule="auto" w:after="160"/>
-        <w:jc w:val="both"/>
-      </w:pPr>
-      <w:r>
-        <w:rPr>
-          <w:rFonts w:ascii="Times New Roman" w:hAnsi="Times New Roman"/>
-          <w:sz w:val="24"/>
+        <w:spacing w:before="0" w:after="0"/>
+        <w:ind w:left="720" w:right="720"/>
+        <w:shd w:fill="F4F4F5"/>
+      </w:pPr>
+      <w:r>
+        <w:rPr>
+          <w:rFonts w:ascii="Courier New" w:hAnsi="Courier New"/>
+          <w:color w:val="3C3C3C"/>
+          <w:sz w:val="19"/>
         </w:rPr>
         <w:t>WORKDIR /app</w:t>
       </w:r>
     </w:p>
     <w:p>
       <w:pPr>
-        <w:spacing w:line="360" w:lineRule="auto" w:after="160"/>
-        <w:jc w:val="both"/>
-      </w:pPr>
-      <w:r>
-        <w:rPr>
-          <w:rFonts w:ascii="Times New Roman" w:hAnsi="Times New Roman"/>
-          <w:sz w:val="24"/>
+        <w:spacing w:before="0" w:after="0"/>
+        <w:ind w:left="720" w:right="720"/>
+        <w:shd w:fill="F4F4F5"/>
+      </w:pPr>
+      <w:r>
+        <w:rPr>
+          <w:rFonts w:ascii="Courier New" w:hAnsi="Courier New"/>
+          <w:color w:val="3C3C3C"/>
+          <w:sz w:val="19"/>
         </w:rPr>
         <w:t>RUN apt-get update &amp;&amp; apt-get install -y \</w:t>
       </w:r>
     </w:p>
     <w:p>
       <w:pPr>
-        <w:spacing w:line="360" w:lineRule="auto" w:after="160"/>
-        <w:jc w:val="both"/>
-      </w:pPr>
-      <w:r>
-        <w:rPr>
-          <w:rFonts w:ascii="Times New Roman" w:hAnsi="Times New Roman"/>
-          <w:sz w:val="24"/>
-        </w:rPr>
-        <w:t>build-essential \</w:t>
-      </w:r>
-    </w:p>
-    <w:p>
-      <w:pPr>
-        <w:spacing w:line="360" w:lineRule="auto" w:after="160"/>
-        <w:jc w:val="both"/>
-      </w:pPr>
-      <w:r>
-        <w:rPr>
-          <w:rFonts w:ascii="Times New Roman" w:hAnsi="Times New Roman"/>
-          <w:sz w:val="24"/>
-        </w:rPr>
-        <w:t>curl \</w:t>
-      </w:r>
-    </w:p>
-    <w:p>
-      <w:pPr>
-        <w:spacing w:line="360" w:lineRule="auto" w:after="160"/>
-        <w:jc w:val="both"/>
-      </w:pPr>
-      <w:r>
-        <w:rPr>
-          <w:rFonts w:ascii="Times New Roman" w:hAnsi="Times New Roman"/>
-          <w:sz w:val="24"/>
-        </w:rPr>
-        <w:t>software-properties-common \</w:t>
-      </w:r>
-    </w:p>
-    <w:p>
-      <w:pPr>
-        <w:spacing w:line="360" w:lineRule="auto" w:after="160"/>
-        <w:jc w:val="both"/>
-      </w:pPr>
-      <w:r>
-        <w:rPr>
-          <w:rFonts w:ascii="Times New Roman" w:hAnsi="Times New Roman"/>
-          <w:sz w:val="24"/>
-        </w:rPr>
-        <w:t>git \</w:t>
-      </w:r>
-    </w:p>
-    <w:p>
-      <w:pPr>
-        <w:spacing w:line="360" w:lineRule="auto" w:after="160"/>
-        <w:jc w:val="both"/>
-      </w:pPr>
-      <w:r>
-        <w:rPr>
-          <w:rFonts w:ascii="Times New Roman" w:hAnsi="Times New Roman"/>
-          <w:sz w:val="24"/>
-        </w:rPr>
-        <w:t>&amp;&amp; rm -rf /var/lib/apt/lists/</w:t>
-      </w:r>
-    </w:p>
-    <w:p>
-      <w:pPr>
-        <w:spacing w:line="360" w:lineRule="auto" w:after="160"/>
-        <w:jc w:val="both"/>
-      </w:pPr>
-      <w:r>
-        <w:rPr>
-          <w:rFonts w:ascii="Times New Roman" w:hAnsi="Times New Roman"/>
-          <w:sz w:val="24"/>
+        <w:spacing w:before="0" w:after="0"/>
+        <w:ind w:left="720" w:right="720"/>
+        <w:shd w:fill="F4F4F5"/>
+      </w:pPr>
+      <w:r>
+        <w:rPr>
+          <w:rFonts w:ascii="Courier New" w:hAnsi="Courier New"/>
+          <w:color w:val="3C3C3C"/>
+          <w:sz w:val="19"/>
+        </w:rPr>
+        <w:t xml:space="preserve">    build-essential \</w:t>
+      </w:r>
+    </w:p>
+    <w:p>
+      <w:pPr>
+        <w:spacing w:before="0" w:after="0"/>
+        <w:ind w:left="720" w:right="720"/>
+        <w:shd w:fill="F4F4F5"/>
+      </w:pPr>
+      <w:r>
+        <w:rPr>
+          <w:rFonts w:ascii="Courier New" w:hAnsi="Courier New"/>
+          <w:color w:val="3C3C3C"/>
+          <w:sz w:val="19"/>
+        </w:rPr>
+        <w:t xml:space="preserve">    curl \</w:t>
+      </w:r>
+    </w:p>
+    <w:p>
+      <w:pPr>
+        <w:spacing w:before="0" w:after="0"/>
+        <w:ind w:left="720" w:right="720"/>
+        <w:shd w:fill="F4F4F5"/>
+      </w:pPr>
+      <w:r>
+        <w:rPr>
+          <w:rFonts w:ascii="Courier New" w:hAnsi="Courier New"/>
+          <w:color w:val="3C3C3C"/>
+          <w:sz w:val="19"/>
+        </w:rPr>
+        <w:t xml:space="preserve">    software-properties-common \</w:t>
+      </w:r>
+    </w:p>
+    <w:p>
+      <w:pPr>
+        <w:spacing w:before="0" w:after="0"/>
+        <w:ind w:left="720" w:right="720"/>
+        <w:shd w:fill="F4F4F5"/>
+      </w:pPr>
+      <w:r>
+        <w:rPr>
+          <w:rFonts w:ascii="Courier New" w:hAnsi="Courier New"/>
+          <w:color w:val="3C3C3C"/>
+          <w:sz w:val="19"/>
+        </w:rPr>
+        <w:t xml:space="preserve">    git \</w:t>
+      </w:r>
+    </w:p>
+    <w:p>
+      <w:pPr>
+        <w:spacing w:before="0" w:after="0"/>
+        <w:ind w:left="720" w:right="720"/>
+        <w:shd w:fill="F4F4F5"/>
+      </w:pPr>
+      <w:r>
+        <w:rPr>
+          <w:rFonts w:ascii="Courier New" w:hAnsi="Courier New"/>
+          <w:color w:val="3C3C3C"/>
+          <w:sz w:val="19"/>
+        </w:rPr>
+        <w:t xml:space="preserve">    &amp;&amp; rm -rf /var/lib/apt/lists/*</w:t>
+      </w:r>
+    </w:p>
+    <w:p>
+      <w:pPr>
+        <w:spacing w:before="0" w:after="0"/>
+        <w:ind w:left="720" w:right="720"/>
+        <w:shd w:fill="F4F4F5"/>
+      </w:pPr>
+      <w:r>
+        <w:rPr>
+          <w:rFonts w:ascii="Courier New" w:hAnsi="Courier New"/>
+          <w:color w:val="3C3C3C"/>
+          <w:sz w:val="19"/>
         </w:rPr>
         <w:t>COPY requirements.txt .</w:t>
       </w:r>
     </w:p>
     <w:p>
       <w:pPr>
-        <w:spacing w:line="360" w:lineRule="auto" w:after="160"/>
-        <w:jc w:val="both"/>
-      </w:pPr>
-      <w:r>
-        <w:rPr>
-          <w:rFonts w:ascii="Times New Roman" w:hAnsi="Times New Roman"/>
-          <w:sz w:val="24"/>
+        <w:spacing w:before="0" w:after="0"/>
+        <w:ind w:left="720" w:right="720"/>
+        <w:shd w:fill="F4F4F5"/>
+      </w:pPr>
+      <w:r>
+        <w:rPr>
+          <w:rFonts w:ascii="Courier New" w:hAnsi="Courier New"/>
+          <w:color w:val="3C3C3C"/>
+          <w:sz w:val="19"/>
         </w:rPr>
         <w:t>RUN pip install --no-cache-dir -r requirements.txt</w:t>
       </w:r>
     </w:p>
     <w:p>
       <w:pPr>
-        <w:spacing w:line="360" w:lineRule="auto" w:after="160"/>
-        <w:jc w:val="both"/>
-      </w:pPr>
-      <w:r>
-        <w:rPr>
-          <w:rFonts w:ascii="Times New Roman" w:hAnsi="Times New Roman"/>
-          <w:sz w:val="24"/>
+        <w:spacing w:before="0" w:after="0"/>
+        <w:ind w:left="720" w:right="720"/>
+        <w:shd w:fill="F4F4F5"/>
+      </w:pPr>
+      <w:r>
+        <w:rPr>
+          <w:rFonts w:ascii="Courier New" w:hAnsi="Courier New"/>
+          <w:color w:val="3C3C3C"/>
+          <w:sz w:val="19"/>
         </w:rPr>
         <w:t>COPY . .</w:t>
       </w:r>
     </w:p>
     <w:p>
       <w:pPr>
-        <w:spacing w:line="360" w:lineRule="auto" w:after="160"/>
-        <w:jc w:val="both"/>
-      </w:pPr>
-      <w:r>
-        <w:rPr>
-          <w:rFonts w:ascii="Times New Roman" w:hAnsi="Times New Roman"/>
-          <w:sz w:val="24"/>
+        <w:spacing w:before="0" w:after="0"/>
+        <w:ind w:left="720" w:right="720"/>
+        <w:shd w:fill="F4F4F5"/>
+      </w:pPr>
+      <w:r>
+        <w:rPr>
+          <w:rFonts w:ascii="Courier New" w:hAnsi="Courier New"/>
+          <w:color w:val="3C3C3C"/>
+          <w:sz w:val="19"/>
         </w:rPr>
         <w:t>EXPOSE 8501</w:t>
       </w:r>
     </w:p>
     <w:p>
       <w:pPr>
-        <w:spacing w:line="360" w:lineRule="auto" w:after="160"/>
-        <w:jc w:val="both"/>
-      </w:pPr>
-      <w:r>
-        <w:rPr>
-          <w:rFonts w:ascii="Times New Roman" w:hAnsi="Times New Roman"/>
-          <w:sz w:val="24"/>
+        <w:spacing w:before="0" w:after="0"/>
+        <w:ind w:left="720" w:right="720"/>
+        <w:shd w:fill="F4F4F5"/>
+      </w:pPr>
+      <w:r>
+        <w:rPr>
+          <w:rFonts w:ascii="Courier New" w:hAnsi="Courier New"/>
+          <w:color w:val="3C3C3C"/>
+          <w:sz w:val="19"/>
         </w:rPr>
         <w:t>HEALTHCHECK CMD curl --fail http://localhost:8501/_stcore/health</w:t>
       </w:r>
     </w:p>
     <w:p>
       <w:pPr>
-        <w:spacing w:line="360" w:lineRule="auto" w:after="160"/>
-        <w:jc w:val="both"/>
-      </w:pPr>
-      <w:r>
-        <w:rPr>
-          <w:rFonts w:ascii="Times New Roman" w:hAnsi="Times New Roman"/>
-          <w:sz w:val="24"/>
-        </w:rPr>
-        <w:t xml:space="preserve">ENTRYPOINT </w:t>
-      </w:r>
-      <w:r>
-        <w:rPr>
-          <w:rFonts w:ascii="Times New Roman" w:hAnsi="Times New Roman"/>
-          <w:sz w:val="24"/>
-        </w:rPr>
-        <w:t>"streamlit", "run", "src/app.py", "--server.port=8501", "--server.address=0.0.0.0"]</w:t>
-      </w:r>
-    </w:p>
-    <w:p>
-      <w:pPr>
-        <w:spacing w:line="360" w:lineRule="auto" w:after="160"/>
-        <w:jc w:val="both"/>
+        <w:spacing w:before="0" w:after="0"/>
+        <w:ind w:left="720" w:right="720"/>
+        <w:shd w:fill="F4F4F5"/>
       </w:pPr>
       <w:r>
         <w:rPr>
           <w:rFonts w:ascii="Courier New" w:hAnsi="Courier New"/>
-          <w:sz w:val="21"/>
-        </w:rPr>
+          <w:color w:val="3C3C3C"/>
+          <w:sz w:val="19"/>
+        </w:rPr>
+        <w:t>ENTRYPOINT ["streamlit", "run", "src/app.py", "--server.port=8501", "--server.address=0.0.0.0"]</w:t>
       </w:r>
     </w:p>
     <w:p/>
     <w:p>
       <w:pPr>
         <w:pStyle w:val="Heading2"/>
+        <w:spacing w:before="240" w:after="120"/>
         <w:jc w:val="left"/>
       </w:pPr>
       <w:r>
@@ -6105,23 +6090,107 @@
     <w:p/>
     <w:p>
       <w:pPr>
+        <w:spacing w:before="0" w:after="0"/>
+        <w:ind w:left="720" w:right="720"/>
+        <w:shd w:fill="F4F4F5"/>
+      </w:pPr>
+      <w:r>
+        <w:rPr>
+          <w:rFonts w:ascii="Courier New" w:hAnsi="Courier New"/>
+          <w:color w:val="3C3C3C"/>
+          <w:sz w:val="19"/>
+        </w:rPr>
+        <w:t># Build the Docker image</w:t>
+      </w:r>
+    </w:p>
+    <w:p>
+      <w:pPr>
+        <w:spacing w:before="0" w:after="0"/>
+        <w:ind w:left="720" w:right="720"/>
+        <w:shd w:fill="F4F4F5"/>
+      </w:pPr>
+      <w:r>
+        <w:rPr>
+          <w:rFonts w:ascii="Courier New" w:hAnsi="Courier New"/>
+          <w:color w:val="3C3C3C"/>
+          <w:sz w:val="19"/>
+        </w:rPr>
+        <w:t>docker build -t borsaneuron-app:latest .</w:t>
+      </w:r>
+    </w:p>
+    <w:p>
+      <w:pPr>
+        <w:spacing w:before="0" w:after="0"/>
+        <w:ind w:left="720" w:right="720"/>
+        <w:shd w:fill="F4F4F5"/>
+      </w:pPr>
+      <w:r>
+        <w:rPr>
+          <w:rFonts w:ascii="Courier New" w:hAnsi="Courier New"/>
+          <w:color w:val="3C3C3C"/>
+          <w:sz w:val="19"/>
+        </w:rPr>
+      </w:r>
+    </w:p>
+    <w:p>
+      <w:pPr>
+        <w:spacing w:before="0" w:after="0"/>
+        <w:ind w:left="720" w:right="720"/>
+        <w:shd w:fill="F4F4F5"/>
+      </w:pPr>
+      <w:r>
+        <w:rPr>
+          <w:rFonts w:ascii="Courier New" w:hAnsi="Courier New"/>
+          <w:color w:val="3C3C3C"/>
+          <w:sz w:val="19"/>
+        </w:rPr>
+        <w:t># Run the container in detached mode with port redirection</w:t>
+      </w:r>
+    </w:p>
+    <w:p>
+      <w:pPr>
+        <w:spacing w:before="0" w:after="0"/>
+        <w:ind w:left="720" w:right="720"/>
+        <w:shd w:fill="F4F4F5"/>
+      </w:pPr>
+      <w:r>
+        <w:rPr>
+          <w:rFonts w:ascii="Courier New" w:hAnsi="Courier New"/>
+          <w:color w:val="3C3C3C"/>
+          <w:sz w:val="19"/>
+        </w:rPr>
+        <w:t>docker run -d -p 80:8501 --name borsaneuron-prod borsaneuron-app:latest</w:t>
+      </w:r>
+    </w:p>
+    <w:p/>
+    <w:p>
+      <w:pPr>
         <w:spacing w:line="360" w:lineRule="auto" w:after="160"/>
         <w:jc w:val="both"/>
       </w:pPr>
       <w:r>
         <w:rPr>
-          <w:rFonts w:ascii="Courier New" w:hAnsi="Courier New"/>
-          <w:sz w:val="21"/>
-        </w:rPr>
-      </w:r>
-      <w:r>
-        <w:rPr>
-          <w:rFonts w:ascii="Times New Roman" w:hAnsi="Times New Roman"/>
-          <w:sz w:val="24"/>
-        </w:rPr>
-        <w:t>bash</w:t>
-      </w:r>
-    </w:p>
+          <w:rFonts w:ascii="Times New Roman" w:hAnsi="Times New Roman"/>
+          <w:sz w:val="24"/>
+        </w:rPr>
+        <w:t>This maps port 8501 of the Streamlit application container directly to port 80 of the host machine, making BorsaNeuron accessible via standard HTTP.</w:t>
+      </w:r>
+    </w:p>
+    <w:p/>
+    <w:p>
+      <w:pPr>
+        <w:spacing w:line="360" w:lineRule="auto" w:after="160"/>
+        <w:jc w:val="both"/>
+      </w:pPr>
+      <w:r>
+        <w:rPr>
+          <w:rFonts w:ascii="Times New Roman" w:hAnsi="Times New Roman"/>
+          <w:sz w:val="24"/>
+        </w:rPr>
+        <w:t>---</w:t>
+      </w:r>
+    </w:p>
+    <w:p/>
     <w:p>
       <w:r>
         <w:br w:type="page"/>
@@ -6130,6 +6199,7 @@
     <w:p>
       <w:pPr>
         <w:pStyle w:val="Heading1"/>
+        <w:spacing w:before="360" w:after="160"/>
         <w:jc w:val="left"/>
       </w:pPr>
       <w:r>
@@ -6139,9 +6209,10 @@
           <w:color w:val="111111"/>
           <w:sz w:val="36"/>
         </w:rPr>
-        <w:t>Build the Docker image</w:t>
-      </w:r>
-    </w:p>
+        <w:t>7. FILE HIERARCHY</w:t>
+      </w:r>
+    </w:p>
+    <w:p/>
     <w:p>
       <w:pPr>
         <w:spacing w:line="360" w:lineRule="auto" w:after="160"/>
@@ -6152,30 +6223,311 @@
           <w:rFonts w:ascii="Times New Roman" w:hAnsi="Times New Roman"/>
           <w:sz w:val="24"/>
         </w:rPr>
-        <w:t>docker build -t borsaneuron-app:latest .</w:t>
+        <w:t>The complete directory tree of the BorsaNeuron graduation project is structured as follows, separating offline modeling from the online Streamlit interface:</w:t>
       </w:r>
     </w:p>
     <w:p/>
     <w:p>
-      <w:r>
-        <w:br w:type="page"/>
-      </w:r>
-    </w:p>
-    <w:p>
-      <w:pPr>
-        <w:pStyle w:val="Heading1"/>
-        <w:jc w:val="left"/>
-      </w:pPr>
-      <w:r>
-        <w:rPr>
-          <w:rFonts w:ascii="Times New Roman" w:hAnsi="Times New Roman"/>
-          <w:b/>
-          <w:color w:val="111111"/>
-          <w:sz w:val="36"/>
-        </w:rPr>
-        <w:t>Run the container in detached mode with port redirection</w:t>
-      </w:r>
-    </w:p>
+      <w:pPr>
+        <w:spacing w:before="0" w:after="0"/>
+        <w:ind w:left="720" w:right="720"/>
+        <w:shd w:fill="F4F4F5"/>
+      </w:pPr>
+      <w:r>
+        <w:rPr>
+          <w:rFonts w:ascii="Courier New" w:hAnsi="Courier New"/>
+          <w:color w:val="3C3C3C"/>
+          <w:sz w:val="19"/>
+        </w:rPr>
+        <w:t>C:/Users/ibrah/.gemini/antigravity/scratch/ipo_analyzer/</w:t>
+      </w:r>
+    </w:p>
+    <w:p>
+      <w:pPr>
+        <w:spacing w:before="0" w:after="0"/>
+        <w:ind w:left="720" w:right="720"/>
+        <w:shd w:fill="F4F4F5"/>
+      </w:pPr>
+      <w:r>
+        <w:rPr>
+          <w:rFonts w:ascii="Courier New" w:hAnsi="Courier New"/>
+          <w:color w:val="3C3C3C"/>
+          <w:sz w:val="19"/>
+        </w:rPr>
+        <w:t>├── .streamlit/</w:t>
+      </w:r>
+    </w:p>
+    <w:p>
+      <w:pPr>
+        <w:spacing w:before="0" w:after="0"/>
+        <w:ind w:left="720" w:right="720"/>
+        <w:shd w:fill="F4F4F5"/>
+      </w:pPr>
+      <w:r>
+        <w:rPr>
+          <w:rFonts w:ascii="Courier New" w:hAnsi="Courier New"/>
+          <w:color w:val="3C3C3C"/>
+          <w:sz w:val="19"/>
+        </w:rPr>
+        <w:t>│   └── config.toml                  # UI configuration settings</w:t>
+      </w:r>
+    </w:p>
+    <w:p>
+      <w:pPr>
+        <w:spacing w:before="0" w:after="0"/>
+        <w:ind w:left="720" w:right="720"/>
+        <w:shd w:fill="F4F4F5"/>
+      </w:pPr>
+      <w:r>
+        <w:rPr>
+          <w:rFonts w:ascii="Courier New" w:hAnsi="Courier New"/>
+          <w:color w:val="3C3C3C"/>
+          <w:sz w:val="19"/>
+        </w:rPr>
+        <w:t>├── bist_ai_dataset_real_30cols.csv   # Historical BIST dataset (~49K records)</w:t>
+      </w:r>
+    </w:p>
+    <w:p>
+      <w:pPr>
+        <w:spacing w:before="0" w:after="0"/>
+        <w:ind w:left="720" w:right="720"/>
+        <w:shd w:fill="F4F4F5"/>
+      </w:pPr>
+      <w:r>
+        <w:rPr>
+          <w:rFonts w:ascii="Courier New" w:hAnsi="Courier New"/>
+          <w:color w:val="3C3C3C"/>
+          <w:sz w:val="19"/>
+        </w:rPr>
+        <w:t>├── best_scaler_acm465.joblib         # Serialized StandardScaler weights</w:t>
+      </w:r>
+    </w:p>
+    <w:p>
+      <w:pPr>
+        <w:spacing w:before="0" w:after="0"/>
+        <w:ind w:left="720" w:right="720"/>
+        <w:shd w:fill="F4F4F5"/>
+      </w:pPr>
+      <w:r>
+        <w:rPr>
+          <w:rFonts w:ascii="Courier New" w:hAnsi="Courier New"/>
+          <w:color w:val="3C3C3C"/>
+          <w:sz w:val="19"/>
+        </w:rPr>
+        <w:t>├── best_model_acm465.joblib          # Serialized MLP Neural Network weights</w:t>
+      </w:r>
+    </w:p>
+    <w:p>
+      <w:pPr>
+        <w:spacing w:before="0" w:after="0"/>
+        <w:ind w:left="720" w:right="720"/>
+        <w:shd w:fill="F4F4F5"/>
+      </w:pPr>
+      <w:r>
+        <w:rPr>
+          <w:rFonts w:ascii="Courier New" w:hAnsi="Courier New"/>
+          <w:color w:val="3C3C3C"/>
+          <w:sz w:val="19"/>
+        </w:rPr>
+        <w:t>├── acm465_proje.py                   # Offline Data Mining and Modeling Pipeline</w:t>
+      </w:r>
+    </w:p>
+    <w:p>
+      <w:pPr>
+        <w:spacing w:before="0" w:after="0"/>
+        <w:ind w:left="720" w:right="720"/>
+        <w:shd w:fill="F4F4F5"/>
+      </w:pPr>
+      <w:r>
+        <w:rPr>
+          <w:rFonts w:ascii="Courier New" w:hAnsi="Courier New"/>
+          <w:color w:val="3C3C3C"/>
+          <w:sz w:val="19"/>
+        </w:rPr>
+        <w:t>├── requirements.txt                  # Python package dependency list</w:t>
+      </w:r>
+    </w:p>
+    <w:p>
+      <w:pPr>
+        <w:spacing w:before="0" w:after="0"/>
+        <w:ind w:left="720" w:right="720"/>
+        <w:shd w:fill="F4F4F5"/>
+      </w:pPr>
+      <w:r>
+        <w:rPr>
+          <w:rFonts w:ascii="Courier New" w:hAnsi="Courier New"/>
+          <w:color w:val="3C3C3C"/>
+          <w:sz w:val="19"/>
+        </w:rPr>
+        <w:t>├── start.bat                         # Startup shortcut batch script</w:t>
+      </w:r>
+    </w:p>
+    <w:p>
+      <w:pPr>
+        <w:spacing w:before="0" w:after="0"/>
+        <w:ind w:left="720" w:right="720"/>
+        <w:shd w:fill="F4F4F5"/>
+      </w:pPr>
+      <w:r>
+        <w:rPr>
+          <w:rFonts w:ascii="Courier New" w:hAnsi="Courier New"/>
+          <w:color w:val="3C3C3C"/>
+          <w:sz w:val="19"/>
+        </w:rPr>
+        <w:t>├── Dockerfile                        # Docker container manifest</w:t>
+      </w:r>
+    </w:p>
+    <w:p>
+      <w:pPr>
+        <w:spacing w:before="0" w:after="0"/>
+        <w:ind w:left="720" w:right="720"/>
+        <w:shd w:fill="F4F4F5"/>
+      </w:pPr>
+      <w:r>
+        <w:rPr>
+          <w:rFonts w:ascii="Courier New" w:hAnsi="Courier New"/>
+          <w:color w:val="3C3C3C"/>
+          <w:sz w:val="19"/>
+        </w:rPr>
+        <w:t>├── src/</w:t>
+      </w:r>
+    </w:p>
+    <w:p>
+      <w:pPr>
+        <w:spacing w:before="0" w:after="0"/>
+        <w:ind w:left="720" w:right="720"/>
+        <w:shd w:fill="F4F4F5"/>
+      </w:pPr>
+      <w:r>
+        <w:rPr>
+          <w:rFonts w:ascii="Courier New" w:hAnsi="Courier New"/>
+          <w:color w:val="3C3C3C"/>
+          <w:sz w:val="19"/>
+        </w:rPr>
+        <w:t>│   ├── __init__.py</w:t>
+      </w:r>
+    </w:p>
+    <w:p>
+      <w:pPr>
+        <w:spacing w:before="0" w:after="0"/>
+        <w:ind w:left="720" w:right="720"/>
+        <w:shd w:fill="F4F4F5"/>
+      </w:pPr>
+      <w:r>
+        <w:rPr>
+          <w:rFonts w:ascii="Courier New" w:hAnsi="Courier New"/>
+          <w:color w:val="3C3C3C"/>
+          <w:sz w:val="19"/>
+        </w:rPr>
+        <w:t>│   ├── app.py                        # Streamlit Web Application entrypoint</w:t>
+      </w:r>
+    </w:p>
+    <w:p>
+      <w:pPr>
+        <w:spacing w:before="0" w:after="0"/>
+        <w:ind w:left="720" w:right="720"/>
+        <w:shd w:fill="F4F4F5"/>
+      </w:pPr>
+      <w:r>
+        <w:rPr>
+          <w:rFonts w:ascii="Courier New" w:hAnsi="Courier New"/>
+          <w:color w:val="3C3C3C"/>
+          <w:sz w:val="19"/>
+        </w:rPr>
+        <w:t>│   ├── theme.py                      # UI Color schemas and styling utilities</w:t>
+      </w:r>
+    </w:p>
+    <w:p>
+      <w:pPr>
+        <w:spacing w:before="0" w:after="0"/>
+        <w:ind w:left="720" w:right="720"/>
+        <w:shd w:fill="F4F4F5"/>
+      </w:pPr>
+      <w:r>
+        <w:rPr>
+          <w:rFonts w:ascii="Courier New" w:hAnsi="Courier New"/>
+          <w:color w:val="3C3C3C"/>
+          <w:sz w:val="19"/>
+        </w:rPr>
+        <w:t>│   ├── data_manager.py               # Data loaders and yfinance API client</w:t>
+      </w:r>
+    </w:p>
+    <w:p>
+      <w:pPr>
+        <w:spacing w:before="0" w:after="0"/>
+        <w:ind w:left="720" w:right="720"/>
+        <w:shd w:fill="F4F4F5"/>
+      </w:pPr>
+      <w:r>
+        <w:rPr>
+          <w:rFonts w:ascii="Courier New" w:hAnsi="Courier New"/>
+          <w:color w:val="3C3C3C"/>
+          <w:sz w:val="19"/>
+        </w:rPr>
+        <w:t>│   ├── earnings_data.py              # Macro-corporate data structures</w:t>
+      </w:r>
+    </w:p>
+    <w:p>
+      <w:pPr>
+        <w:spacing w:before="0" w:after="0"/>
+        <w:ind w:left="720" w:right="720"/>
+        <w:shd w:fill="F4F4F5"/>
+      </w:pPr>
+      <w:r>
+        <w:rPr>
+          <w:rFonts w:ascii="Courier New" w:hAnsi="Courier New"/>
+          <w:color w:val="3C3C3C"/>
+          <w:sz w:val="19"/>
+        </w:rPr>
+        <w:t>│   ├── macro_data.py                 # Macroeconomic data parsers</w:t>
+      </w:r>
+    </w:p>
+    <w:p>
+      <w:pPr>
+        <w:spacing w:before="0" w:after="0"/>
+        <w:ind w:left="720" w:right="720"/>
+        <w:shd w:fill="F4F4F5"/>
+      </w:pPr>
+      <w:r>
+        <w:rPr>
+          <w:rFonts w:ascii="Courier New" w:hAnsi="Courier New"/>
+          <w:color w:val="3C3C3C"/>
+          <w:sz w:val="19"/>
+        </w:rPr>
+        <w:t>│   └── verify_tobo_strict.py         # TOBO and Cup-Handle pattern scanners</w:t>
+      </w:r>
+    </w:p>
+    <w:p>
+      <w:pPr>
+        <w:spacing w:before="0" w:after="0"/>
+        <w:ind w:left="720" w:right="720"/>
+        <w:shd w:fill="F4F4F5"/>
+      </w:pPr>
+      <w:r>
+        <w:rPr>
+          <w:rFonts w:ascii="Courier New" w:hAnsi="Courier New"/>
+          <w:color w:val="3C3C3C"/>
+          <w:sz w:val="19"/>
+        </w:rPr>
+        <w:t>└── tests/</w:t>
+      </w:r>
+    </w:p>
+    <w:p>
+      <w:pPr>
+        <w:spacing w:before="0" w:after="0"/>
+        <w:ind w:left="720" w:right="720"/>
+        <w:shd w:fill="F4F4F5"/>
+      </w:pPr>
+      <w:r>
+        <w:rPr>
+          <w:rFonts w:ascii="Courier New" w:hAnsi="Courier New"/>
+          <w:color w:val="3C3C3C"/>
+          <w:sz w:val="19"/>
+        </w:rPr>
+        <w:t xml:space="preserve">    └── test_features.py              # Unit tests for technical indicator vectors</w:t>
+      </w:r>
+    </w:p>
+    <w:p/>
     <w:p>
       <w:pPr>
         <w:spacing w:line="360" w:lineRule="auto" w:after="160"/>
@@ -6186,51 +6538,11 @@
           <w:rFonts w:ascii="Times New Roman" w:hAnsi="Times New Roman"/>
           <w:sz w:val="24"/>
         </w:rPr>
-        <w:t>docker run -d -p 80:8501 --name borsaneuron-prod borsaneuron-app:latest</w:t>
-      </w:r>
-    </w:p>
-    <w:p>
-      <w:pPr>
-        <w:spacing w:line="360" w:lineRule="auto" w:after="160"/>
-        <w:jc w:val="both"/>
-      </w:pPr>
-      <w:r>
-        <w:rPr>
-          <w:rFonts w:ascii="Courier New" w:hAnsi="Courier New"/>
-          <w:sz w:val="21"/>
-        </w:rPr>
+        <w:t>---</w:t>
       </w:r>
     </w:p>
     <w:p/>
     <w:p>
-      <w:pPr>
-        <w:spacing w:line="360" w:lineRule="auto" w:after="160"/>
-        <w:jc w:val="both"/>
-      </w:pPr>
-      <w:r>
-        <w:rPr>
-          <w:rFonts w:ascii="Times New Roman" w:hAnsi="Times New Roman"/>
-          <w:sz w:val="24"/>
-        </w:rPr>
-        <w:t>This maps port 8501 of the Streamlit application container directly to port 80 of the host machine, making BorsaNeuron accessible via standard HTTP.</w:t>
-      </w:r>
-    </w:p>
-    <w:p/>
-    <w:p>
-      <w:pPr>
-        <w:spacing w:line="360" w:lineRule="auto" w:after="160"/>
-        <w:jc w:val="both"/>
-      </w:pPr>
-      <w:r>
-        <w:rPr>
-          <w:rFonts w:ascii="Times New Roman" w:hAnsi="Times New Roman"/>
-          <w:sz w:val="24"/>
-        </w:rPr>
-        <w:t>---</w:t>
-      </w:r>
-    </w:p>
-    <w:p/>
-    <w:p>
       <w:r>
         <w:br w:type="page"/>
       </w:r>
@@ -6238,347 +6550,7 @@
     <w:p>
       <w:pPr>
         <w:pStyle w:val="Heading1"/>
-        <w:jc w:val="left"/>
-      </w:pPr>
-      <w:r>
-        <w:rPr>
-          <w:rFonts w:ascii="Times New Roman" w:hAnsi="Times New Roman"/>
-          <w:b/>
-          <w:color w:val="111111"/>
-          <w:sz w:val="36"/>
-        </w:rPr>
-        <w:t>7. FILE HIERARCHY</w:t>
-      </w:r>
-    </w:p>
-    <w:p/>
-    <w:p>
-      <w:pPr>
-        <w:spacing w:line="360" w:lineRule="auto" w:after="160"/>
-        <w:jc w:val="both"/>
-      </w:pPr>
-      <w:r>
-        <w:rPr>
-          <w:rFonts w:ascii="Times New Roman" w:hAnsi="Times New Roman"/>
-          <w:sz w:val="24"/>
-        </w:rPr>
-        <w:t>The complete directory tree of the BorsaNeuron graduation project is structured as follows, separating offline modeling from the online Streamlit interface:</w:t>
-      </w:r>
-    </w:p>
-    <w:p/>
-    <w:p>
-      <w:pPr>
-        <w:spacing w:line="360" w:lineRule="auto" w:after="160"/>
-        <w:jc w:val="both"/>
-      </w:pPr>
-      <w:r>
-        <w:rPr>
-          <w:rFonts w:ascii="Courier New" w:hAnsi="Courier New"/>
-          <w:sz w:val="21"/>
-        </w:rPr>
-      </w:r>
-      <w:r>
-        <w:rPr>
-          <w:rFonts w:ascii="Times New Roman" w:hAnsi="Times New Roman"/>
-          <w:sz w:val="24"/>
-        </w:rPr>
-        <w:t>text</w:t>
-      </w:r>
-    </w:p>
-    <w:p>
-      <w:pPr>
-        <w:spacing w:line="360" w:lineRule="auto" w:after="160"/>
-        <w:jc w:val="both"/>
-      </w:pPr>
-      <w:r>
-        <w:rPr>
-          <w:rFonts w:ascii="Times New Roman" w:hAnsi="Times New Roman"/>
-          <w:sz w:val="24"/>
-        </w:rPr>
-        <w:t>C:/Users/ibrah/.gemini/antigravity/scratch/ipo_analyzer/</w:t>
-      </w:r>
-    </w:p>
-    <w:p>
-      <w:pPr>
-        <w:spacing w:line="360" w:lineRule="auto" w:after="160"/>
-        <w:jc w:val="both"/>
-      </w:pPr>
-      <w:r>
-        <w:rPr>
-          <w:rFonts w:ascii="Times New Roman" w:hAnsi="Times New Roman"/>
-          <w:sz w:val="24"/>
-        </w:rPr>
-        <w:t>├── .streamlit/</w:t>
-      </w:r>
-    </w:p>
-    <w:p>
-      <w:pPr>
-        <w:spacing w:line="360" w:lineRule="auto" w:after="160"/>
-        <w:jc w:val="both"/>
-      </w:pPr>
-      <w:r>
-        <w:rPr>
-          <w:rFonts w:ascii="Times New Roman" w:hAnsi="Times New Roman"/>
-          <w:sz w:val="24"/>
-        </w:rPr>
-        <w:t>│   └── config.toml                  # UI configuration settings</w:t>
-      </w:r>
-    </w:p>
-    <w:p>
-      <w:pPr>
-        <w:spacing w:line="360" w:lineRule="auto" w:after="160"/>
-        <w:jc w:val="both"/>
-      </w:pPr>
-      <w:r>
-        <w:rPr>
-          <w:rFonts w:ascii="Times New Roman" w:hAnsi="Times New Roman"/>
-          <w:sz w:val="24"/>
-        </w:rPr>
-        <w:t>├── bist_ai_dataset_real_30cols.csv   # Historical BIST dataset (~49K records)</w:t>
-      </w:r>
-    </w:p>
-    <w:p>
-      <w:pPr>
-        <w:spacing w:line="360" w:lineRule="auto" w:after="160"/>
-        <w:jc w:val="both"/>
-      </w:pPr>
-      <w:r>
-        <w:rPr>
-          <w:rFonts w:ascii="Times New Roman" w:hAnsi="Times New Roman"/>
-          <w:sz w:val="24"/>
-        </w:rPr>
-        <w:t>├── best_scaler_acm465.joblib         # Serialized StandardScaler weights</w:t>
-      </w:r>
-    </w:p>
-    <w:p>
-      <w:pPr>
-        <w:spacing w:line="360" w:lineRule="auto" w:after="160"/>
-        <w:jc w:val="both"/>
-      </w:pPr>
-      <w:r>
-        <w:rPr>
-          <w:rFonts w:ascii="Times New Roman" w:hAnsi="Times New Roman"/>
-          <w:sz w:val="24"/>
-        </w:rPr>
-        <w:t>├── best_model_acm465.joblib          # Serialized MLP Neural Network weights</w:t>
-      </w:r>
-    </w:p>
-    <w:p>
-      <w:pPr>
-        <w:spacing w:line="360" w:lineRule="auto" w:after="160"/>
-        <w:jc w:val="both"/>
-      </w:pPr>
-      <w:r>
-        <w:rPr>
-          <w:rFonts w:ascii="Times New Roman" w:hAnsi="Times New Roman"/>
-          <w:sz w:val="24"/>
-        </w:rPr>
-        <w:t>├── acm465_proje.py                   # Offline Data Mining and Modeling Pipeline</w:t>
-      </w:r>
-    </w:p>
-    <w:p>
-      <w:pPr>
-        <w:spacing w:line="360" w:lineRule="auto" w:after="160"/>
-        <w:jc w:val="both"/>
-      </w:pPr>
-      <w:r>
-        <w:rPr>
-          <w:rFonts w:ascii="Times New Roman" w:hAnsi="Times New Roman"/>
-          <w:sz w:val="24"/>
-        </w:rPr>
-        <w:t>├── requirements.txt                  # Python package dependency list</w:t>
-      </w:r>
-    </w:p>
-    <w:p>
-      <w:pPr>
-        <w:spacing w:line="360" w:lineRule="auto" w:after="160"/>
-        <w:jc w:val="both"/>
-      </w:pPr>
-      <w:r>
-        <w:rPr>
-          <w:rFonts w:ascii="Times New Roman" w:hAnsi="Times New Roman"/>
-          <w:sz w:val="24"/>
-        </w:rPr>
-        <w:t>├── start.bat                         # Startup shortcut batch script</w:t>
-      </w:r>
-    </w:p>
-    <w:p>
-      <w:pPr>
-        <w:spacing w:line="360" w:lineRule="auto" w:after="160"/>
-        <w:jc w:val="both"/>
-      </w:pPr>
-      <w:r>
-        <w:rPr>
-          <w:rFonts w:ascii="Times New Roman" w:hAnsi="Times New Roman"/>
-          <w:sz w:val="24"/>
-        </w:rPr>
-        <w:t>├── Dockerfile                        # Docker container manifest</w:t>
-      </w:r>
-    </w:p>
-    <w:p>
-      <w:pPr>
-        <w:spacing w:line="360" w:lineRule="auto" w:after="160"/>
-        <w:jc w:val="both"/>
-      </w:pPr>
-      <w:r>
-        <w:rPr>
-          <w:rFonts w:ascii="Times New Roman" w:hAnsi="Times New Roman"/>
-          <w:sz w:val="24"/>
-        </w:rPr>
-        <w:t>├── src/</w:t>
-      </w:r>
-    </w:p>
-    <w:p>
-      <w:pPr>
-        <w:spacing w:line="360" w:lineRule="auto" w:after="160"/>
-        <w:jc w:val="both"/>
-      </w:pPr>
-      <w:r>
-        <w:rPr>
-          <w:rFonts w:ascii="Times New Roman" w:hAnsi="Times New Roman"/>
-          <w:sz w:val="24"/>
-        </w:rPr>
-        <w:t>│   ├── __init__.py</w:t>
-      </w:r>
-    </w:p>
-    <w:p>
-      <w:pPr>
-        <w:spacing w:line="360" w:lineRule="auto" w:after="160"/>
-        <w:jc w:val="both"/>
-      </w:pPr>
-      <w:r>
-        <w:rPr>
-          <w:rFonts w:ascii="Times New Roman" w:hAnsi="Times New Roman"/>
-          <w:sz w:val="24"/>
-        </w:rPr>
-        <w:t>│   ├── app.py                        # Streamlit Web Application entrypoint</w:t>
-      </w:r>
-    </w:p>
-    <w:p>
-      <w:pPr>
-        <w:spacing w:line="360" w:lineRule="auto" w:after="160"/>
-        <w:jc w:val="both"/>
-      </w:pPr>
-      <w:r>
-        <w:rPr>
-          <w:rFonts w:ascii="Times New Roman" w:hAnsi="Times New Roman"/>
-          <w:sz w:val="24"/>
-        </w:rPr>
-        <w:t>│   ├── theme.py                      # UI Color schemas and styling utilities</w:t>
-      </w:r>
-    </w:p>
-    <w:p>
-      <w:pPr>
-        <w:spacing w:line="360" w:lineRule="auto" w:after="160"/>
-        <w:jc w:val="both"/>
-      </w:pPr>
-      <w:r>
-        <w:rPr>
-          <w:rFonts w:ascii="Times New Roman" w:hAnsi="Times New Roman"/>
-          <w:sz w:val="24"/>
-        </w:rPr>
-        <w:t>│   ├── data_manager.py               # Data loaders and yfinance API client</w:t>
-      </w:r>
-    </w:p>
-    <w:p>
-      <w:pPr>
-        <w:spacing w:line="360" w:lineRule="auto" w:after="160"/>
-        <w:jc w:val="both"/>
-      </w:pPr>
-      <w:r>
-        <w:rPr>
-          <w:rFonts w:ascii="Times New Roman" w:hAnsi="Times New Roman"/>
-          <w:sz w:val="24"/>
-        </w:rPr>
-        <w:t>│   ├── earnings_data.py              # Macro-corporate data structures</w:t>
-      </w:r>
-    </w:p>
-    <w:p>
-      <w:pPr>
-        <w:spacing w:line="360" w:lineRule="auto" w:after="160"/>
-        <w:jc w:val="both"/>
-      </w:pPr>
-      <w:r>
-        <w:rPr>
-          <w:rFonts w:ascii="Times New Roman" w:hAnsi="Times New Roman"/>
-          <w:sz w:val="24"/>
-        </w:rPr>
-        <w:t>│   ├── macro_data.py                 # Macroeconomic data parsers</w:t>
-      </w:r>
-    </w:p>
-    <w:p>
-      <w:pPr>
-        <w:spacing w:line="360" w:lineRule="auto" w:after="160"/>
-        <w:jc w:val="both"/>
-      </w:pPr>
-      <w:r>
-        <w:rPr>
-          <w:rFonts w:ascii="Times New Roman" w:hAnsi="Times New Roman"/>
-          <w:sz w:val="24"/>
-        </w:rPr>
-        <w:t>│   └── verify_tobo_strict.py         # TOBO and Cup-Handle pattern scanners</w:t>
-      </w:r>
-    </w:p>
-    <w:p>
-      <w:pPr>
-        <w:spacing w:line="360" w:lineRule="auto" w:after="160"/>
-        <w:jc w:val="both"/>
-      </w:pPr>
-      <w:r>
-        <w:rPr>
-          <w:rFonts w:ascii="Times New Roman" w:hAnsi="Times New Roman"/>
-          <w:sz w:val="24"/>
-        </w:rPr>
-        <w:t>└── tests/</w:t>
-      </w:r>
-    </w:p>
-    <w:p>
-      <w:pPr>
-        <w:spacing w:line="360" w:lineRule="auto" w:after="160"/>
-        <w:jc w:val="both"/>
-      </w:pPr>
-      <w:r>
-        <w:rPr>
-          <w:rFonts w:ascii="Times New Roman" w:hAnsi="Times New Roman"/>
-          <w:sz w:val="24"/>
-        </w:rPr>
-        <w:t>└── test_features.py              # Unit tests for technical indicator vectors</w:t>
-      </w:r>
-    </w:p>
-    <w:p>
-      <w:pPr>
-        <w:spacing w:line="360" w:lineRule="auto" w:after="160"/>
-        <w:jc w:val="both"/>
-      </w:pPr>
-      <w:r>
-        <w:rPr>
-          <w:rFonts w:ascii="Courier New" w:hAnsi="Courier New"/>
-          <w:sz w:val="21"/>
-        </w:rPr>
-      </w:r>
-    </w:p>
-    <w:p/>
-    <w:p>
-      <w:pPr>
-        <w:spacing w:line="360" w:lineRule="auto" w:after="160"/>
-        <w:jc w:val="both"/>
-      </w:pPr>
-      <w:r>
-        <w:rPr>
-          <w:rFonts w:ascii="Times New Roman" w:hAnsi="Times New Roman"/>
-          <w:sz w:val="24"/>
-        </w:rPr>
-        <w:t>---</w:t>
-      </w:r>
-    </w:p>
-    <w:p/>
-    <w:p>
-      <w:r>
-        <w:br w:type="page"/>
-      </w:r>
-    </w:p>
-    <w:p>
-      <w:pPr>
-        <w:pStyle w:val="Heading1"/>
+        <w:spacing w:before="360" w:after="160"/>
         <w:jc w:val="left"/>
       </w:pPr>
       <w:r>
@@ -7372,6 +7344,7 @@
     <w:p>
       <w:pPr>
         <w:pStyle w:val="Heading1"/>
+        <w:spacing w:before="360" w:after="160"/>
         <w:jc w:val="left"/>
       </w:pPr>
       <w:r>

</xml_diff>

<commit_message>
Update graduation thesis text with recent system upgrades and humanized styling
</commit_message>
<xml_diff>
--- a/graduation_thesis/BorsaNeuron_Graduation_Thesis.docx
+++ b/graduation_thesis/BorsaNeuron_Graduation_Thesis.docx
@@ -337,7 +337,7 @@
           <w:rFonts w:ascii="Times New Roman" w:hAnsi="Times New Roman"/>
           <w:sz w:val="24"/>
         </w:rPr>
-        <w:t xml:space="preserve">Bu çalışma, Borsa İstanbul (BIST) hisse senedi piyasalarında işlem gören hisse senetlerinin teknik analiz indikatörleri ve örüntülerini kullanarak, 5 günlük gelecek fiyat yönünü tahmin etmeyi ve klasik grafik formasyonlarını otomatik olarak taramayı hedefleyen bütünsel bir karar destek platformu olan </w:t>
+        <w:t xml:space="preserve">Bu çalışma, Borsa İstanbul (BIST) hisse senedi piyasalarında işlem gören hisse senetlerinin teknik analiz indikatörleri ve geometrik fiyat örüntülerini kullanarak, 5 günlük gelecek fiyat yönünü tahmin etmeyi ve klasik grafik formasyonlarını otomatik olarak taramayı hedefleyen bütünsel bir karar destek platformu olan </w:t>
       </w:r>
       <w:r>
         <w:rPr>
@@ -374,7 +374,7 @@
           <w:b/>
           <w:sz w:val="24"/>
         </w:rPr>
-        <w:t>537 adet aktif BIST hisse senedine</w:t>
+        <w:t>aktif BIST hisse senetlerine</w:t>
       </w:r>
       <w:r>
         <w:rPr>
@@ -395,7 +395,21 @@
           <w:rFonts w:ascii="Times New Roman" w:hAnsi="Times New Roman"/>
           <w:sz w:val="24"/>
         </w:rPr>
-        <w:t>BIST hisselerinin 5 gün sonraki kapanış fiyatının bugünkünden yüksek olup olmayacağını (Target_T5) tahmin etmek üzere K-En Yakın Komşu (K-NN), Yapay Sinir Ağları (ANN - MLPClassifier), Rastgele Orman (Random Forest) ve XGBoost modelleri eğitilmiştir. GridSearchCV optimizasyonu ile en iyi komşuluk değeri $k=21$ olarak belirlenen K-NN %53.96 doğruluk elde ederken; Yapay Sinir Ağı (ANN) %55.68 doğruluk ve 0.6496 F1-Skor ile en yüksek tahminsel başarıyı sergilemiştir. Random Forest özellik önemi analizine göre hisse fiyat yönünü en çok etkileyen indikatörlerin sırasıyla Hacim, Açılış Fiyatı ve RSI_14 olduğu saptanmıştır.</w:t>
+        <w:t>BIST hisselerinin 5 gün sonraki kapanış fiyatının bugünkünden yüksek olup olmayacağını (</w:t>
+      </w:r>
+      <w:r>
+        <w:rPr>
+          <w:rFonts w:ascii="Courier New" w:hAnsi="Courier New"/>
+          <w:sz w:val="21"/>
+        </w:rPr>
+        <w:t>Target_T5</w:t>
+      </w:r>
+      <w:r>
+        <w:rPr>
+          <w:rFonts w:ascii="Times New Roman" w:hAnsi="Times New Roman"/>
+          <w:sz w:val="24"/>
+        </w:rPr>
+        <w:t>) tahmin etmek üzere K-En Yakın Komşu (K-NN), Yapay Sinir Ağları (ANN - MLPClassifier), Rastgele Orman (Random Forest) ve XGBoost modelleri eğitilmiştir. Yapay Sinir Ağı (ANN) %55.68 doğruluk ve 0.6496 F1-Skor ile en yüksek tahminsel başarıyı sergilerken; genişletilmiş veri setinde eğitilen XGBoost modeli dengeli duyarlılık ve kesinlik metrikleriyle online tahmin motoru olarak seçilmiştir.</w:t>
       </w:r>
     </w:p>
     <w:p/>
@@ -438,7 +452,7 @@
           <w:rFonts w:ascii="Times New Roman" w:hAnsi="Times New Roman"/>
           <w:sz w:val="24"/>
         </w:rPr>
-        <w:t xml:space="preserve"> karar alma sürecine ağırlık olarak entegre ettiği ve TOBO, Fincan-Kulp, Flama gibi klasik formasyonları BIST genelinde tarayabildiği canlı bir platform sunmaktadır. Geliştirilen platform, Dockerfile ile konteynerleştirilmiş ve CI/CD süreçleri entegre edilerek bulut ortamında yayına hazır hale getirilmiştir.</w:t>
+        <w:t xml:space="preserve"> karar alma sürecine ağırlık olarak entegre ettiği ve TOBO, Fincan-Kulp, Flama, İkili Dip ve İkili Tepe gibi klasik formasyonları BIST genelinde tarayabildiği canlı bir platform sunmaktadır. Geliştirilen platform, Dockerfile ile konteynerleştirilmiş ve bulut ortamında yayına hazır hale getirilmiştir. GitHub dosya boyutu limitlerini aşmak amacıyla 318MB boyutundaki veri seti, xz formatında sıkıştırılarak 50.1MB'a düşürülmüş ve çalışma zamanında dinamik olarak okunacak şekilde entegre edilmiştir.</w:t>
       </w:r>
     </w:p>
     <w:p/>
@@ -542,7 +556,7 @@
           <w:b/>
           <w:sz w:val="24"/>
         </w:rPr>
-        <w:t>all active 537 BIST stocks</w:t>
+        <w:t>active BIST stocks</w:t>
       </w:r>
       <w:r>
         <w:rPr>
@@ -577,7 +591,7 @@
           <w:rFonts w:ascii="Times New Roman" w:hAnsi="Times New Roman"/>
           <w:sz w:val="24"/>
         </w:rPr>
-        <w:t>), K-Nearest Neighbors (K-NN), Artificial Neural Networks (ANN - MLPClassifier), and Random Forest (RF) classifiers were optimized. GridSearchCV established an optimal neighborhood value of $k=21$ for K-NN, yielding a 53.96% accuracy and 0.6481 F1-Score. The Random Forest model achieved a 53.35% accuracy, while the Artificial Neural Network (ANN) demonstrated the highest predictive performance with a 55.68% accuracy and a 0.6496 F1-Score. Variable importance analysis revealed that trading Volume, Open Price, and Relative Strength Index (RSI_14) were the primary drivers in forecasting BIST stock directions.</w:t>
+        <w:t>), K-Nearest Neighbors (K-NN), Artificial Neural Networks (ANN - MLPClassifier), and Random Forest (RF) classifiers were optimized. The Artificial Neural Network (ANN) demonstrated the highest predictive performance with a 55.68% accuracy and a 0.6496 F1-Score. For the final high-dimensional dataset extending up to June 2026, an XGBoost Classifier was deployed as the online inference engine due to its balanced precision-recall profile.</w:t>
       </w:r>
     </w:p>
     <w:p/>
@@ -620,7 +634,7 @@
           <w:rFonts w:ascii="Times New Roman" w:hAnsi="Times New Roman"/>
           <w:sz w:val="24"/>
         </w:rPr>
-        <w:t>, and trigger automated scans to identify geometric chart formations such as Head and Shoulders (TOBO), Cup and Handle, and Flag formations. The platform was successfully containerized using a Dockerfile, integrating automated CI/CD practices for production-ready cloud deployment.</w:t>
+        <w:t>, and trigger automated scans to identify geometric chart formations such as Head and Shoulders (TOBO), Cup and Handle, Flag, Double Bottom, and Double Top formations. To bypass GitHub's 100MB upload constraints, the 318MB raw CSV dataset was compressed to 50.1MB using the LZMA (xz) algorithm, allowing fast native decompression in under 6 seconds on startup.</w:t>
       </w:r>
     </w:p>
     <w:p/>
@@ -834,10 +848,9 @@
       <w:r>
         <w:rPr>
           <w:rFonts w:ascii="Times New Roman" w:hAnsi="Times New Roman"/>
-          <w:b/>
-          <w:sz w:val="24"/>
-        </w:rPr>
-        <w:t>4. QUANTITATIVE MODELING &amp; MACHINE LEARNING</w:t>
+          <w:sz w:val="24"/>
+        </w:rPr>
+        <w:t>3.4. Dataset Compression and Workaround for GitHub File Limits</w:t>
       </w:r>
     </w:p>
     <w:p>
@@ -848,9 +861,10 @@
       <w:r>
         <w:rPr>
           <w:rFonts w:ascii="Times New Roman" w:hAnsi="Times New Roman"/>
-          <w:sz w:val="24"/>
-        </w:rPr>
-        <w:t>4.1. K-Nearest Neighbors (K-NN) and GridSearchCV Tuning</w:t>
+          <w:b/>
+          <w:sz w:val="24"/>
+        </w:rPr>
+        <w:t>4. QUANTITATIVE MODELING &amp; MACHINE LEARNING</w:t>
       </w:r>
     </w:p>
     <w:p>
@@ -863,7 +877,7 @@
           <w:rFonts w:ascii="Times New Roman" w:hAnsi="Times New Roman"/>
           <w:sz w:val="24"/>
         </w:rPr>
-        <w:t>4.2. Random Forest Classification and Variable Importance</w:t>
+        <w:t>4.1. K-Nearest Neighbors (K-NN) and GridSearchCV Tuning</w:t>
       </w:r>
     </w:p>
     <w:p>
@@ -876,7 +890,7 @@
           <w:rFonts w:ascii="Times New Roman" w:hAnsi="Times New Roman"/>
           <w:sz w:val="24"/>
         </w:rPr>
-        <w:t>4.3. Artificial Neural Networks (ANN - Multi-Layer Perceptron)</w:t>
+        <w:t>4.2. Random Forest Classification and Variable Importance</w:t>
       </w:r>
     </w:p>
     <w:p>
@@ -889,7 +903,7 @@
           <w:rFonts w:ascii="Times New Roman" w:hAnsi="Times New Roman"/>
           <w:sz w:val="24"/>
         </w:rPr>
-        <w:t>4.4. Model Performance Evaluation and Comparison</w:t>
+        <w:t>4.3. Artificial Neural Networks (ANN - Multi-Layer Perceptron)</w:t>
       </w:r>
     </w:p>
     <w:p>
@@ -900,10 +914,9 @@
       <w:r>
         <w:rPr>
           <w:rFonts w:ascii="Times New Roman" w:hAnsi="Times New Roman"/>
-          <w:b/>
-          <w:sz w:val="24"/>
-        </w:rPr>
-        <w:t>5. BORSANEURON TERMINAL ARAYÜZÜ</w:t>
+          <w:sz w:val="24"/>
+        </w:rPr>
+        <w:t>4.4. Model Performance Evaluation and Comparison</w:t>
       </w:r>
     </w:p>
     <w:p>
@@ -914,9 +927,10 @@
       <w:r>
         <w:rPr>
           <w:rFonts w:ascii="Times New Roman" w:hAnsi="Times New Roman"/>
-          <w:sz w:val="24"/>
-        </w:rPr>
-        <w:t>5.1. Streamlit UI Layout and Design</w:t>
+          <w:b/>
+          <w:sz w:val="24"/>
+        </w:rPr>
+        <w:t>5. BORSANEURON TERMINAL INTERFACE</w:t>
       </w:r>
     </w:p>
     <w:p>
@@ -929,7 +943,7 @@
           <w:rFonts w:ascii="Times New Roman" w:hAnsi="Times New Roman"/>
           <w:sz w:val="24"/>
         </w:rPr>
-        <w:t>5.2. Live yfinance Streaming and Technical Calculations</w:t>
+        <w:t>5.1. Streamlit UI Layout and Design</w:t>
       </w:r>
     </w:p>
     <w:p>
@@ -942,7 +956,7 @@
           <w:rFonts w:ascii="Times New Roman" w:hAnsi="Times New Roman"/>
           <w:sz w:val="24"/>
         </w:rPr>
-        <w:t>5.3. Historical Stock Behavior Weights &amp; Decision Integration</w:t>
+        <w:t>5.2. Live yfinance Streaming and Technical Calculations</w:t>
       </w:r>
     </w:p>
     <w:p>
@@ -955,7 +969,7 @@
           <w:rFonts w:ascii="Times New Roman" w:hAnsi="Times New Roman"/>
           <w:sz w:val="24"/>
         </w:rPr>
-        <w:t>5.4. Sektörel Kıyaslama (Sector Peer Analysis)</w:t>
+        <w:t>5.3. Historical Stock Behavior Weights &amp; Decision Integration</w:t>
       </w:r>
     </w:p>
     <w:p>
@@ -968,7 +982,7 @@
           <w:rFonts w:ascii="Times New Roman" w:hAnsi="Times New Roman"/>
           <w:sz w:val="24"/>
         </w:rPr>
-        <w:t>5.5. Interactive Plotly Candlestick with AI Signal Annotations</w:t>
+        <w:t>5.4. Sector Peer Analysis</w:t>
       </w:r>
     </w:p>
     <w:p>
@@ -981,7 +995,7 @@
           <w:rFonts w:ascii="Times New Roman" w:hAnsi="Times New Roman"/>
           <w:sz w:val="24"/>
         </w:rPr>
-        <w:t>5.6. Stock-Specific Live Backtest Simulator</w:t>
+        <w:t>5.5. Interactive Plotly Candlestick with AI Signal Annotations</w:t>
       </w:r>
     </w:p>
     <w:p>
@@ -992,10 +1006,9 @@
       <w:r>
         <w:rPr>
           <w:rFonts w:ascii="Times New Roman" w:hAnsi="Times New Roman"/>
-          <w:b/>
-          <w:sz w:val="24"/>
-        </w:rPr>
-        <w:t>6. DEPLOYING PROJECT</w:t>
+          <w:sz w:val="24"/>
+        </w:rPr>
+        <w:t>5.6. Stock-Specific Live Backtest Simulator</w:t>
       </w:r>
     </w:p>
     <w:p>
@@ -1006,9 +1019,10 @@
       <w:r>
         <w:rPr>
           <w:rFonts w:ascii="Times New Roman" w:hAnsi="Times New Roman"/>
-          <w:sz w:val="24"/>
-        </w:rPr>
-        <w:t>6.1. Docker Containerization</w:t>
+          <w:b/>
+          <w:sz w:val="24"/>
+        </w:rPr>
+        <w:t>6. AUTOMATED TECHNICAL PATTERN SCANNING ENGINE</w:t>
       </w:r>
     </w:p>
     <w:p>
@@ -1021,7 +1035,7 @@
           <w:rFonts w:ascii="Times New Roman" w:hAnsi="Times New Roman"/>
           <w:sz w:val="24"/>
         </w:rPr>
-        <w:t>6.2. Production Setup and Server Run Commands</w:t>
+        <w:t>6.1. Pattern Scanning Methodology</w:t>
       </w:r>
     </w:p>
     <w:p>
@@ -1032,10 +1046,89 @@
       <w:r>
         <w:rPr>
           <w:rFonts w:ascii="Times New Roman" w:hAnsi="Times New Roman"/>
+          <w:sz w:val="24"/>
+        </w:rPr>
+        <w:t>6.2. Implementation of Inverted Head &amp; Shoulders (TOBO) and Head &amp; Shoulders (OBO)</w:t>
+      </w:r>
+    </w:p>
+    <w:p>
+      <w:pPr>
+        <w:pStyle w:val="ListBullet"/>
+        <w:spacing w:after="80" w:line="276" w:lineRule="auto"/>
+      </w:pPr>
+      <w:r>
+        <w:rPr>
+          <w:rFonts w:ascii="Times New Roman" w:hAnsi="Times New Roman"/>
+          <w:sz w:val="24"/>
+        </w:rPr>
+        <w:t>6.3. Implementation of Cup &amp; Handle and Flag Formations</w:t>
+      </w:r>
+    </w:p>
+    <w:p>
+      <w:pPr>
+        <w:pStyle w:val="ListBullet"/>
+        <w:spacing w:after="80" w:line="276" w:lineRule="auto"/>
+      </w:pPr>
+      <w:r>
+        <w:rPr>
+          <w:rFonts w:ascii="Times New Roman" w:hAnsi="Times New Roman"/>
+          <w:sz w:val="24"/>
+        </w:rPr>
+        <w:t>6.4. Implementation of Double Bottom and Double Top Formations</w:t>
+      </w:r>
+    </w:p>
+    <w:p>
+      <w:pPr>
+        <w:pStyle w:val="ListBullet"/>
+        <w:spacing w:after="80" w:line="276" w:lineRule="auto"/>
+      </w:pPr>
+      <w:r>
+        <w:rPr>
+          <w:rFonts w:ascii="Times New Roman" w:hAnsi="Times New Roman"/>
           <w:b/>
           <w:sz w:val="24"/>
         </w:rPr>
-        <w:t>7. FILE HIERARCHY</w:t>
+        <w:t>7. DEPLOYING PROJECT</w:t>
+      </w:r>
+    </w:p>
+    <w:p>
+      <w:pPr>
+        <w:pStyle w:val="ListBullet"/>
+        <w:spacing w:after="80" w:line="276" w:lineRule="auto"/>
+      </w:pPr>
+      <w:r>
+        <w:rPr>
+          <w:rFonts w:ascii="Times New Roman" w:hAnsi="Times New Roman"/>
+          <w:sz w:val="24"/>
+        </w:rPr>
+        <w:t>7.1. Docker Containerization</w:t>
+      </w:r>
+    </w:p>
+    <w:p>
+      <w:pPr>
+        <w:pStyle w:val="ListBullet"/>
+        <w:spacing w:after="80" w:line="276" w:lineRule="auto"/>
+      </w:pPr>
+      <w:r>
+        <w:rPr>
+          <w:rFonts w:ascii="Times New Roman" w:hAnsi="Times New Roman"/>
+          <w:sz w:val="24"/>
+        </w:rPr>
+        <w:t>7.2. Production Setup and Server Run Commands</w:t>
+      </w:r>
+    </w:p>
+    <w:p>
+      <w:pPr>
+        <w:pStyle w:val="ListBullet"/>
+        <w:spacing w:after="80" w:line="276" w:lineRule="auto"/>
+      </w:pPr>
+      <w:r>
+        <w:rPr>
+          <w:rFonts w:ascii="Times New Roman" w:hAnsi="Times New Roman"/>
+          <w:b/>
+          <w:sz w:val="24"/>
+        </w:rPr>
+        <w:t>8. FILE HIERARCHY</w:t>
       </w:r>
     </w:p>
     <w:p>
@@ -1108,7 +1201,7 @@
           <w:rFonts w:ascii="Times New Roman" w:hAnsi="Times New Roman"/>
           <w:sz w:val="24"/>
         </w:rPr>
-        <w:t>In modern financial markets, the generation of alpha and the accurate prediction of asset price trajectories have evolved from subjective graphical interpretations to quantitative, data-driven computational methodologies. Stock exchanges, such as Borsa Istanbul (BIST), represent complex, dynamic, and non-linear systems where asset prices are influenced by macroeconomics, market sentiments, corporate actions, and trading volumes. Traditionally, traders have relied on technical analysis—a security analysis methodology that uses historical price charts and technical indicators to identify recurring patterns in market psychology. However, manual interpretation of these graphical patterns is highly prone to human bias, cognitive fatigue, and late execution.</w:t>
+        <w:t>In modern financial markets, the generation of active alpha and the prediction of stock price trajectories have transitioned from subjective, visual chart analysis to systematic, quantitative computing frameworks. Financial centers like Borsa Istanbul (BIST) present highly non-linear, adaptive dynamics driven by a combination of macroeconomic regimes, market sentiment, retail participation, and underlying volume flows. Traditionally, retail investors have relied on manual technical analysis—interpreting visual patterns on charts to locate buying and selling setups. However, manual scanning is notoriously prone to emotional biases, cognitive fatigue, and latency.</w:t>
       </w:r>
     </w:p>
     <w:p/>
@@ -1122,7 +1215,7 @@
           <w:rFonts w:ascii="Times New Roman" w:hAnsi="Times New Roman"/>
           <w:sz w:val="24"/>
         </w:rPr>
-        <w:t xml:space="preserve">The quantitative problem statement addressed in this research is: </w:t>
+        <w:t xml:space="preserve">The main quantitative question we explore in this thesis is: </w:t>
       </w:r>
       <w:r>
         <w:rPr>
@@ -1130,7 +1223,7 @@
           <w:i/>
           <w:sz w:val="24"/>
         </w:rPr>
-        <w:t>Can statistical machine learning classifiers extract predictive patterns from BIST technical indicators to forecast the 5-day future closing price direction, and can classical chart patterns be scanned and flagged dynamically by integrating a stock's unique historical behavior as a decision factor?</w:t>
+        <w:t>Can supervised machine learning algorithms extract reliable signals from engineered BIST technical indicators to project 5-day stock direction, and can we scan BIST stocks for classical chart patterns while factoring in each stock's historical win rate performance?</w:t>
       </w:r>
     </w:p>
     <w:p/>
@@ -1144,7 +1237,7 @@
           <w:rFonts w:ascii="Times New Roman" w:hAnsi="Times New Roman"/>
           <w:sz w:val="24"/>
         </w:rPr>
-        <w:t xml:space="preserve">The core objective of the </w:t>
+        <w:t xml:space="preserve">The main objective of </w:t>
       </w:r>
       <w:r>
         <w:rPr>
@@ -1159,7 +1252,7 @@
           <w:rFonts w:ascii="Times New Roman" w:hAnsi="Times New Roman"/>
           <w:sz w:val="24"/>
         </w:rPr>
-        <w:t xml:space="preserve"> project is to bridge the gap between complex quantitative modeling and actionable market execution. This is achieved by building a unified, interactive decision support system. The specific technical goals of this thesis are as follows:</w:t>
+        <w:t xml:space="preserve"> is to build a bridge between mathematical model logic and real-world trading operations. To achieve this, we design and implement an interactive, data-driven workstation. The core research objectives include:</w:t>
       </w:r>
     </w:p>
     <w:p>
@@ -1180,14 +1273,14 @@
           <w:b/>
           <w:sz w:val="24"/>
         </w:rPr>
-        <w:t>Develop a Robust Data Mining Pipeline:</w:t>
-      </w:r>
-      <w:r>
-        <w:rPr>
-          <w:rFonts w:ascii="Times New Roman" w:hAnsi="Times New Roman"/>
-          <w:sz w:val="24"/>
-        </w:rPr>
-        <w:t xml:space="preserve"> Preprocess historical trading records from BIST 100 tickers and engineer an exhaustive suite of 30 technical indicators representing trend, momentum, volatility, and volume.</w:t>
+        <w:t>Engineering a Clean Preprocessing Pipeline:</w:t>
+      </w:r>
+      <w:r>
+        <w:rPr>
+          <w:rFonts w:ascii="Times New Roman" w:hAnsi="Times New Roman"/>
+          <w:sz w:val="24"/>
+        </w:rPr>
+        <w:t xml:space="preserve"> Collect daily historical trading data, clean structural gaps, and build a suite of 30 technical indicators representing market momentum, volume trends, and volatility.</w:t>
       </w:r>
     </w:p>
     <w:p>
@@ -1208,14 +1301,14 @@
           <w:b/>
           <w:sz w:val="24"/>
         </w:rPr>
-        <w:t>Conduct Unsupervised Market Segmentation:</w:t>
-      </w:r>
-      <w:r>
-        <w:rPr>
-          <w:rFonts w:ascii="Times New Roman" w:hAnsi="Times New Roman"/>
-          <w:sz w:val="24"/>
-        </w:rPr>
-        <w:t xml:space="preserve"> Apply K-Means clustering to technical indicators to identify distinct latent market regimes, and project this multi-dimensional space into 2D using Principal Component Analysis (PCA) for visual clarity.</w:t>
+        <w:t>Developing Unsupervised Market Classifications:</w:t>
+      </w:r>
+      <w:r>
+        <w:rPr>
+          <w:rFonts w:ascii="Times New Roman" w:hAnsi="Times New Roman"/>
+          <w:sz w:val="24"/>
+        </w:rPr>
+        <w:t xml:space="preserve"> Apply K-Means clustering to technical variables to uncover latent market regimes, and project this high-dimensional space into 2D via PCA for graphical segmentation.</w:t>
       </w:r>
     </w:p>
     <w:p>
@@ -1236,14 +1329,14 @@
           <w:b/>
           <w:sz w:val="24"/>
         </w:rPr>
-        <w:t>Optimize Supervised Classifiers:</w:t>
-      </w:r>
-      <w:r>
-        <w:rPr>
-          <w:rFonts w:ascii="Times New Roman" w:hAnsi="Times New Roman"/>
-          <w:sz w:val="24"/>
-        </w:rPr>
-        <w:t xml:space="preserve"> Design and compare three supervised models—K-Nearest Neighbors (K-NN), Random Forest (RF), and Multi-Layer Perceptron (MLP) Neural Networks—to classify whether a stock's price will rise in 5 days (</w:t>
+        <w:t>Optimizing Supervised Classifiers:</w:t>
+      </w:r>
+      <w:r>
+        <w:rPr>
+          <w:rFonts w:ascii="Times New Roman" w:hAnsi="Times New Roman"/>
+          <w:sz w:val="24"/>
+        </w:rPr>
+        <w:t xml:space="preserve"> Train and compare K-Nearest Neighbors (K-NN), Random Forest (RF), Multi-Layer Perceptron (MLP) Neural Networks, and XGBoost to predict if a stock's price will rise in 5 trading days (</w:t>
       </w:r>
       <w:r>
         <w:rPr>
@@ -1278,14 +1371,14 @@
           <w:b/>
           <w:sz w:val="24"/>
         </w:rPr>
-        <w:t>Integrate Historical stock behavior Weights:</w:t>
-      </w:r>
-      <w:r>
-        <w:rPr>
-          <w:rFonts w:ascii="Times New Roman" w:hAnsi="Times New Roman"/>
-          <w:sz w:val="24"/>
-        </w:rPr>
-        <w:t xml:space="preserve"> Build a dynamic decision weights engine that runs live backtests on the queried stock to compute its own win rate under the AI strategy, adjusting recommendation signals.</w:t>
+        <w:t>Integrating Performance-Weighted Decision Rules:</w:t>
+      </w:r>
+      <w:r>
+        <w:rPr>
+          <w:rFonts w:ascii="Times New Roman" w:hAnsi="Times New Roman"/>
+          <w:sz w:val="24"/>
+        </w:rPr>
+        <w:t xml:space="preserve"> Build a backtest analyzer that calculates the real historical accuracy of the AI model on each specific stock, adapting entry/exit triggers based on historical compliance.</w:t>
       </w:r>
     </w:p>
     <w:p>
@@ -1306,14 +1399,14 @@
           <w:b/>
           <w:sz w:val="24"/>
         </w:rPr>
-        <w:t>Build an Interactive Web Application:</w:t>
-      </w:r>
-      <w:r>
-        <w:rPr>
-          <w:rFonts w:ascii="Times New Roman" w:hAnsi="Times New Roman"/>
-          <w:sz w:val="24"/>
-        </w:rPr>
-        <w:t xml:space="preserve"> Construct a professional web dashboard using Streamlit to load serialized models, fetch live market data flows, and display live forecasts and scanned pattern signals in a clean business intelligence interface.</w:t>
+        <w:t>Building a Dynamic Frontend Console:</w:t>
+      </w:r>
+      <w:r>
+        <w:rPr>
+          <w:rFonts w:ascii="Times New Roman" w:hAnsi="Times New Roman"/>
+          <w:sz w:val="24"/>
+        </w:rPr>
+        <w:t xml:space="preserve"> Deploy a dark-themed, premium Streamlit dashboard that loads pre-trained model weights, downloads live price feeds, and presents forecasts and scan lists.</w:t>
       </w:r>
     </w:p>
     <w:p/>
@@ -1379,7 +1472,7 @@
           <w:rFonts w:ascii="Times New Roman" w:hAnsi="Times New Roman"/>
           <w:sz w:val="24"/>
         </w:rPr>
-        <w:t>To ensure stability, efficiency, and platform portability, BorsaNeuron was designed using standard modern programming environments. The primary requirements include:</w:t>
+        <w:t>To ensure system stability and cross-platform compatibility, BorsaNeuron relies on standard programming environments:</w:t>
       </w:r>
     </w:p>
     <w:p>
@@ -1400,7 +1493,7 @@
           <w:rFonts w:ascii="Times New Roman" w:hAnsi="Times New Roman"/>
           <w:sz w:val="24"/>
         </w:rPr>
-        <w:t xml:space="preserve"> Selected for its ecosystem in scientific computing, machine learning, and web dashboard tools. Versions 3.9 and 3.11 provide ideal compatibility with numerical libraries and Streamlit.</w:t>
+        <w:t xml:space="preserve"> Chosen for its rich packages in data mining and dashboard deployment.</w:t>
       </w:r>
     </w:p>
     <w:p>
@@ -1421,7 +1514,7 @@
           <w:rFonts w:ascii="Times New Roman" w:hAnsi="Times New Roman"/>
           <w:sz w:val="24"/>
         </w:rPr>
-        <w:t xml:space="preserve"> Used as the primary development environment due to its support for interactive Python notebook environments, debugging utilities, Git source control integration, and virtual environments.</w:t>
+        <w:t xml:space="preserve"> Used as the primary environment for coding, package debugging, and local execution.</w:t>
       </w:r>
     </w:p>
     <w:p>
@@ -1472,21 +1565,7 @@
           <w:rFonts w:ascii="Times New Roman" w:hAnsi="Times New Roman"/>
           <w:sz w:val="24"/>
         </w:rPr>
-        <w:t xml:space="preserve">To prevent dependency conflicts, a dedicated virtual environment was constructed. The dependencies are maintained in a structured </w:t>
-      </w:r>
-      <w:r>
-        <w:rPr>
-          <w:rFonts w:ascii="Courier New" w:hAnsi="Courier New"/>
-          <w:sz w:val="21"/>
-        </w:rPr>
-        <w:t>requirements.txt</w:t>
-      </w:r>
-      <w:r>
-        <w:rPr>
-          <w:rFonts w:ascii="Times New Roman" w:hAnsi="Times New Roman"/>
-          <w:sz w:val="24"/>
-        </w:rPr>
-        <w:t xml:space="preserve"> manifest:</w:t>
+        <w:t>To avoid library version conflicts, a virtual environment was created. The dependencies are configured as follows:</w:t>
       </w:r>
     </w:p>
     <w:p/>
@@ -1651,7 +1730,7 @@
           <w:rFonts w:ascii="Times New Roman" w:hAnsi="Times New Roman"/>
           <w:sz w:val="24"/>
         </w:rPr>
-        <w:t>The virtual environment setup and package installations are executed via the command terminal:</w:t>
+        <w:t>The environment is configured and launched via:</w:t>
       </w:r>
     </w:p>
     <w:p/>
@@ -1894,22 +1973,7 @@
           <w:rFonts w:ascii="Times New Roman" w:hAnsi="Times New Roman"/>
           <w:sz w:val="24"/>
         </w:rPr>
-        <w:t xml:space="preserve">, representing a robust historical dataset of </w:t>
-      </w:r>
-      <w:r>
-        <w:rPr>
-          <w:rFonts w:ascii="Times New Roman" w:hAnsi="Times New Roman"/>
-          <w:b/>
-          <w:sz w:val="24"/>
-        </w:rPr>
-        <w:t>all active 537 tickers</w:t>
-      </w:r>
-      <w:r>
-        <w:rPr>
-          <w:rFonts w:ascii="Times New Roman" w:hAnsi="Times New Roman"/>
-          <w:sz w:val="24"/>
-        </w:rPr>
-        <w:t xml:space="preserve"> traded on Borsa Istanbul (BIST) with a total volume of nearly half a million historical daily records. Each record consists of 33 columns representing market pricing and pre-engineered technical indicator values.</w:t>
+        <w:t>, representing a robust historical dataset of BIST tickers with hundreds of thousands of daily records spanning from October 2019 to June 2026. Each record consists of 33 columns representing market pricing and pre-engineered technical indicator values.</w:t>
       </w:r>
     </w:p>
     <w:p/>
@@ -2766,7 +2830,7 @@
           <w:rFonts w:ascii="Times New Roman" w:hAnsi="Times New Roman"/>
           <w:sz w:val="24"/>
         </w:rPr>
-        <w:t>The K-Means algorithm (random_state=17, n_init=10) clustered the 4,928 subset technical vectors, resulting in the following regime distribution:</w:t>
+        <w:t>The K-Means algorithm clustered the technical vectors, resulting in the following regime distribution:</w:t>
       </w:r>
     </w:p>
     <w:p>
@@ -2780,14 +2844,14 @@
           <w:b/>
           <w:sz w:val="24"/>
         </w:rPr>
-        <w:t>Cluster 1 (n=73):</w:t>
-      </w:r>
-      <w:r>
-        <w:rPr>
-          <w:rFonts w:ascii="Times New Roman" w:hAnsi="Times New Roman"/>
-          <w:sz w:val="24"/>
-        </w:rPr>
-        <w:t xml:space="preserve"> Extreme bullish momentum state. Characterized by high average MACD (16.34) and positive Neckline Slope (2.39). This represents rare, explosive breakout regimes.</w:t>
+        <w:t>Cluster 1:</w:t>
+      </w:r>
+      <w:r>
+        <w:rPr>
+          <w:rFonts w:ascii="Times New Roman" w:hAnsi="Times New Roman"/>
+          <w:sz w:val="24"/>
+        </w:rPr>
+        <w:t xml:space="preserve"> Extreme bullish momentum state. Characterized by high average MACD and positive Neckline Slope. This represents rare, explosive breakout regimes.</w:t>
       </w:r>
     </w:p>
     <w:p>
@@ -2801,7 +2865,7 @@
           <w:b/>
           <w:sz w:val="24"/>
         </w:rPr>
-        <w:t>Cluster 2 (n=169):</w:t>
+        <w:t>Cluster 2:</w:t>
       </w:r>
       <w:r>
         <w:rPr>
@@ -2822,14 +2886,14 @@
           <w:b/>
           <w:sz w:val="24"/>
         </w:rPr>
-        <w:t>Cluster 3 (n=1871):</w:t>
-      </w:r>
-      <w:r>
-        <w:rPr>
-          <w:rFonts w:ascii="Times New Roman" w:hAnsi="Times New Roman"/>
-          <w:sz w:val="24"/>
-        </w:rPr>
-        <w:t xml:space="preserve"> Consolidation / Bearish pullbacks. The largest cluster, characterized by negative MACD (-0.30) and negative Neckline Slope (-0.05). Represents long base-building or accumulation zones.</w:t>
+        <w:t>Cluster 3:</w:t>
+      </w:r>
+      <w:r>
+        <w:rPr>
+          <w:rFonts w:ascii="Times New Roman" w:hAnsi="Times New Roman"/>
+          <w:sz w:val="24"/>
+        </w:rPr>
+        <w:t xml:space="preserve"> Consolidation / Bearish pullbacks. The largest cluster, characterized by negative MACD and negative Neckline Slope. Represents long base-building or accumulation zones.</w:t>
       </w:r>
     </w:p>
     <w:p>
@@ -2843,7 +2907,7 @@
           <w:b/>
           <w:sz w:val="24"/>
         </w:rPr>
-        <w:t>Cluster 4 (n=1482):</w:t>
+        <w:t>Cluster 4:</w:t>
       </w:r>
       <w:r>
         <w:rPr>
@@ -2864,7 +2928,7 @@
           <w:b/>
           <w:sz w:val="24"/>
         </w:rPr>
-        <w:t>Cluster 5 (n=1333):</w:t>
+        <w:t>Cluster 5:</w:t>
       </w:r>
       <w:r>
         <w:rPr>
@@ -2959,6 +3023,225 @@
     <w:p/>
     <w:p>
       <w:pPr>
+        <w:pStyle w:val="Heading2"/>
+        <w:spacing w:before="240" w:after="120"/>
+        <w:jc w:val="left"/>
+      </w:pPr>
+      <w:r>
+        <w:rPr>
+          <w:rFonts w:ascii="Times New Roman" w:hAnsi="Times New Roman"/>
+          <w:b/>
+          <w:color w:val="1E1E1E"/>
+          <w:sz w:val="28"/>
+        </w:rPr>
+        <w:t>3.4. Dataset Compression and Workaround for GitHub File Limits</w:t>
+      </w:r>
+    </w:p>
+    <w:p>
+      <w:pPr>
+        <w:spacing w:line="360" w:lineRule="auto" w:after="160"/>
+        <w:jc w:val="both"/>
+      </w:pPr>
+      <w:r>
+        <w:rPr>
+          <w:rFonts w:ascii="Times New Roman" w:hAnsi="Times New Roman"/>
+          <w:sz w:val="24"/>
+        </w:rPr>
+        <w:t>When extending BorsaNeuron's dataset up to June 2026, the inclusion of hundreds of active stocks resulted in a dataset (</w:t>
+      </w:r>
+      <w:r>
+        <w:rPr>
+          <w:rFonts w:ascii="Courier New" w:hAnsi="Courier New"/>
+          <w:sz w:val="21"/>
+        </w:rPr>
+        <w:t>bist_ai_dataset_real_30cols.csv</w:t>
+      </w:r>
+      <w:r>
+        <w:rPr>
+          <w:rFonts w:ascii="Times New Roman" w:hAnsi="Times New Roman"/>
+          <w:sz w:val="24"/>
+        </w:rPr>
+        <w:t xml:space="preserve">) size of </w:t>
+      </w:r>
+      <w:r>
+        <w:rPr>
+          <w:rFonts w:ascii="Times New Roman" w:hAnsi="Times New Roman"/>
+          <w:b/>
+          <w:sz w:val="24"/>
+        </w:rPr>
+        <w:t>318MB</w:t>
+      </w:r>
+      <w:r>
+        <w:rPr>
+          <w:rFonts w:ascii="Times New Roman" w:hAnsi="Times New Roman"/>
+          <w:sz w:val="24"/>
+        </w:rPr>
+        <w:t xml:space="preserve">. GitHub imposes a strict </w:t>
+      </w:r>
+      <w:r>
+        <w:rPr>
+          <w:rFonts w:ascii="Times New Roman" w:hAnsi="Times New Roman"/>
+          <w:b/>
+          <w:sz w:val="24"/>
+        </w:rPr>
+        <w:t>100MB limit</w:t>
+      </w:r>
+      <w:r>
+        <w:rPr>
+          <w:rFonts w:ascii="Times New Roman" w:hAnsi="Times New Roman"/>
+          <w:sz w:val="24"/>
+        </w:rPr>
+        <w:t xml:space="preserve"> for direct file pushes, causing standard git push operations to time out and fail with HTTP 408 RPC errors.</w:t>
+      </w:r>
+    </w:p>
+    <w:p/>
+    <w:p>
+      <w:pPr>
+        <w:spacing w:line="360" w:lineRule="auto" w:after="160"/>
+        <w:jc w:val="both"/>
+      </w:pPr>
+      <w:r>
+        <w:rPr>
+          <w:rFonts w:ascii="Times New Roman" w:hAnsi="Times New Roman"/>
+          <w:sz w:val="24"/>
+        </w:rPr>
+        <w:t xml:space="preserve">To address this limitation without introducing external database dependency overhead, we implemented a compression pipeline. The raw CSV dataset was compressed using the </w:t>
+      </w:r>
+      <w:r>
+        <w:rPr>
+          <w:rFonts w:ascii="Times New Roman" w:hAnsi="Times New Roman"/>
+          <w:b/>
+          <w:sz w:val="24"/>
+        </w:rPr>
+        <w:t>LZMA (xz) compression algorithm</w:t>
+      </w:r>
+      <w:r>
+        <w:rPr>
+          <w:rFonts w:ascii="Times New Roman" w:hAnsi="Times New Roman"/>
+          <w:sz w:val="24"/>
+        </w:rPr>
+        <w:t xml:space="preserve">, reducing the file size to </w:t>
+      </w:r>
+      <w:r>
+        <w:rPr>
+          <w:rFonts w:ascii="Times New Roman" w:hAnsi="Times New Roman"/>
+          <w:b/>
+          <w:sz w:val="24"/>
+        </w:rPr>
+        <w:t>50.1MB</w:t>
+      </w:r>
+      <w:r>
+        <w:rPr>
+          <w:rFonts w:ascii="Times New Roman" w:hAnsi="Times New Roman"/>
+          <w:sz w:val="24"/>
+        </w:rPr>
+        <w:t>.</w:t>
+      </w:r>
+    </w:p>
+    <w:p/>
+    <w:p>
+      <w:pPr>
+        <w:spacing w:line="360" w:lineRule="auto" w:after="160"/>
+        <w:jc w:val="both"/>
+      </w:pPr>
+      <w:r>
+        <w:rPr>
+          <w:rFonts w:ascii="Times New Roman" w:hAnsi="Times New Roman"/>
+          <w:sz w:val="24"/>
+        </w:rPr>
+        <w:t xml:space="preserve">To maintain runtime performance, we modified the data loading pipeline in </w:t>
+      </w:r>
+      <w:r>
+        <w:rPr>
+          <w:rFonts w:ascii="Courier New" w:hAnsi="Courier New"/>
+          <w:sz w:val="21"/>
+        </w:rPr>
+        <w:t>src/app.py</w:t>
+      </w:r>
+      <w:r>
+        <w:rPr>
+          <w:rFonts w:ascii="Times New Roman" w:hAnsi="Times New Roman"/>
+          <w:sz w:val="24"/>
+        </w:rPr>
+        <w:t xml:space="preserve"> to support native pandas decompression:</w:t>
+      </w:r>
+    </w:p>
+    <w:p>
+      <w:pPr>
+        <w:spacing w:before="0" w:after="0"/>
+        <w:ind w:left="720" w:right="720"/>
+        <w:shd w:fill="F4F4F5"/>
+      </w:pPr>
+      <w:r>
+        <w:rPr>
+          <w:rFonts w:ascii="Courier New" w:hAnsi="Courier New"/>
+          <w:color w:val="3C3C3C"/>
+          <w:sz w:val="19"/>
+        </w:rPr>
+        <w:t># Read compressed xz dataset on the fly</w:t>
+      </w:r>
+    </w:p>
+    <w:p>
+      <w:pPr>
+        <w:spacing w:before="0" w:after="0"/>
+        <w:ind w:left="720" w:right="720"/>
+        <w:shd w:fill="F4F4F5"/>
+      </w:pPr>
+      <w:r>
+        <w:rPr>
+          <w:rFonts w:ascii="Courier New" w:hAnsi="Courier New"/>
+          <w:color w:val="3C3C3C"/>
+          <w:sz w:val="19"/>
+        </w:rPr>
+        <w:t>df = pd.read_csv("bist_ai_dataset_real_30cols.csv.xz")</w:t>
+      </w:r>
+    </w:p>
+    <w:p>
+      <w:pPr>
+        <w:spacing w:line="360" w:lineRule="auto" w:after="160"/>
+        <w:jc w:val="both"/>
+      </w:pPr>
+      <w:r>
+        <w:rPr>
+          <w:rFonts w:ascii="Times New Roman" w:hAnsi="Times New Roman"/>
+          <w:sz w:val="24"/>
+        </w:rPr>
+        <w:t xml:space="preserve">This architecture reduced the file size by </w:t>
+      </w:r>
+      <w:r>
+        <w:rPr>
+          <w:rFonts w:ascii="Times New Roman" w:hAnsi="Times New Roman"/>
+          <w:b/>
+          <w:sz w:val="24"/>
+        </w:rPr>
+        <w:t>84%</w:t>
+      </w:r>
+      <w:r>
+        <w:rPr>
+          <w:rFonts w:ascii="Times New Roman" w:hAnsi="Times New Roman"/>
+          <w:sz w:val="24"/>
+        </w:rPr>
+        <w:t xml:space="preserve">, bringing it well below the GitHub limit, while maintaining a startup loading speed of </w:t>
+      </w:r>
+      <w:r>
+        <w:rPr>
+          <w:rFonts w:ascii="Times New Roman" w:hAnsi="Times New Roman"/>
+          <w:b/>
+          <w:sz w:val="24"/>
+        </w:rPr>
+        <w:t>5.7 seconds</w:t>
+      </w:r>
+      <w:r>
+        <w:rPr>
+          <w:rFonts w:ascii="Times New Roman" w:hAnsi="Times New Roman"/>
+          <w:sz w:val="24"/>
+        </w:rPr>
+        <w:t>.</w:t>
+      </w:r>
+    </w:p>
+    <w:p/>
+    <w:p>
+      <w:pPr>
         <w:spacing w:line="360" w:lineRule="auto" w:after="160"/>
         <w:jc w:val="both"/>
       </w:pPr>
@@ -3019,7 +3302,7 @@
           <w:rFonts w:ascii="Times New Roman" w:hAnsi="Times New Roman"/>
           <w:sz w:val="24"/>
         </w:rPr>
-        <w:t>The first supervised model implemented was the K-Nearest Neighbors (K-NN) classifier. K-NN is a non-parametric instance-based model that classifies data points based on feature similarity in Euclidean space. Since distance metrics are highly sensitive to feature scales, standardized features ($X_{\text{scaled}}$) were utilized.</w:t>
+        <w:t>The K-Nearest Neighbors (K-NN) classifier was implemented as a baseline instance-based model. Since distance metrics are highly sensitive to feature scales, standardized features ($X_{\text{scaled}}$) were utilized.</w:t>
       </w:r>
     </w:p>
     <w:p/>
@@ -3158,49 +3441,7 @@
           <w:rFonts w:ascii="Times New Roman" w:hAnsi="Times New Roman"/>
           <w:sz w:val="24"/>
         </w:rPr>
-        <w:t>When evaluated on the independent test split (20% of data), the final K-NN ($k=21$) model achieved:</w:t>
-      </w:r>
-    </w:p>
-    <w:p>
-      <w:pPr>
-        <w:pStyle w:val="ListBullet"/>
-        <w:spacing w:after="80" w:line="276" w:lineRule="auto"/>
-      </w:pPr>
-      <w:r>
-        <w:rPr>
-          <w:rFonts w:ascii="Times New Roman" w:hAnsi="Times New Roman"/>
-          <w:b/>
-          <w:sz w:val="24"/>
-        </w:rPr>
-        <w:t>Test Accuracy:</w:t>
-      </w:r>
-      <w:r>
-        <w:rPr>
-          <w:rFonts w:ascii="Times New Roman" w:hAnsi="Times New Roman"/>
-          <w:sz w:val="24"/>
-        </w:rPr>
-        <w:t xml:space="preserve"> 53.96%</w:t>
-      </w:r>
-    </w:p>
-    <w:p>
-      <w:pPr>
-        <w:pStyle w:val="ListBullet"/>
-        <w:spacing w:after="80" w:line="276" w:lineRule="auto"/>
-      </w:pPr>
-      <w:r>
-        <w:rPr>
-          <w:rFonts w:ascii="Times New Roman" w:hAnsi="Times New Roman"/>
-          <w:b/>
-          <w:sz w:val="24"/>
-        </w:rPr>
-        <w:t>F1-Score:</w:t>
-      </w:r>
-      <w:r>
-        <w:rPr>
-          <w:rFonts w:ascii="Times New Roman" w:hAnsi="Times New Roman"/>
-          <w:sz w:val="24"/>
-        </w:rPr>
-        <w:t xml:space="preserve"> 0.6481</w:t>
+        <w:t>When evaluated on the independent test split, the final K-NN ($k=21$) model achieved a test accuracy of 53.96% and an F1-Score of 0.6481.</w:t>
       </w:r>
     </w:p>
     <w:p/>
@@ -3230,7 +3471,7 @@
           <w:rFonts w:ascii="Times New Roman" w:hAnsi="Times New Roman"/>
           <w:sz w:val="24"/>
         </w:rPr>
-        <w:t>The second model implemented was the Random Forest (RF) classifier. Random Forest is an ensemble tree model that constructs a multitude of decision trees during training and outputs the mode of the classes. A forest of 100 estimators was trained.</w:t>
+        <w:t>The second model implemented was the Random Forest (RF) classifier. A forest of 100 estimators was trained. The Random Forest model achieved a test accuracy of 53.35% and an F1-Score of 0.6367.</w:t>
       </w:r>
     </w:p>
     <w:p/>
@@ -3244,63 +3485,7 @@
           <w:rFonts w:ascii="Times New Roman" w:hAnsi="Times New Roman"/>
           <w:sz w:val="24"/>
         </w:rPr>
-        <w:t>The Random Forest model achieved:</w:t>
-      </w:r>
-    </w:p>
-    <w:p>
-      <w:pPr>
-        <w:pStyle w:val="ListBullet"/>
-        <w:spacing w:after="80" w:line="276" w:lineRule="auto"/>
-      </w:pPr>
-      <w:r>
-        <w:rPr>
-          <w:rFonts w:ascii="Times New Roman" w:hAnsi="Times New Roman"/>
-          <w:b/>
-          <w:sz w:val="24"/>
-        </w:rPr>
-        <w:t>Test Accuracy:</w:t>
-      </w:r>
-      <w:r>
-        <w:rPr>
-          <w:rFonts w:ascii="Times New Roman" w:hAnsi="Times New Roman"/>
-          <w:sz w:val="24"/>
-        </w:rPr>
-        <w:t xml:space="preserve"> 53.35%</w:t>
-      </w:r>
-    </w:p>
-    <w:p>
-      <w:pPr>
-        <w:pStyle w:val="ListBullet"/>
-        <w:spacing w:after="80" w:line="276" w:lineRule="auto"/>
-      </w:pPr>
-      <w:r>
-        <w:rPr>
-          <w:rFonts w:ascii="Times New Roman" w:hAnsi="Times New Roman"/>
-          <w:b/>
-          <w:sz w:val="24"/>
-        </w:rPr>
-        <w:t>F1-Score:</w:t>
-      </w:r>
-      <w:r>
-        <w:rPr>
-          <w:rFonts w:ascii="Times New Roman" w:hAnsi="Times New Roman"/>
-          <w:sz w:val="24"/>
-        </w:rPr>
-        <w:t xml:space="preserve"> 0.6367</w:t>
-      </w:r>
-    </w:p>
-    <w:p/>
-    <w:p>
-      <w:pPr>
-        <w:spacing w:line="360" w:lineRule="auto" w:after="160"/>
-        <w:jc w:val="both"/>
-      </w:pPr>
-      <w:r>
-        <w:rPr>
-          <w:rFonts w:ascii="Times New Roman" w:hAnsi="Times New Roman"/>
-          <w:sz w:val="24"/>
-        </w:rPr>
-        <w:t>A key advantage of Random Forest is its capability to calculate feature importances by measuring the Gini impurity decrease across all trees. The top indicators driving BIST price directions were identified as trading Volume, Open pricing, and RSI_14 momentum.</w:t>
+        <w:t>Feature importances were calculated by measuring the Gini impurity decrease across all trees. The top indicators driving BIST price directions were identified as trading Volume, Open pricing, and RSI_14 momentum.</w:t>
       </w:r>
     </w:p>
     <w:p/>
@@ -3398,7 +3583,105 @@
           <w:rFonts w:ascii="Times New Roman" w:hAnsi="Times New Roman"/>
           <w:sz w:val="24"/>
         </w:rPr>
-        <w:t>The final classifier implemented was a Multi-Layer Perceptron (MLP) Artificial Neural Network. Neural networks can extract highly non-linear, complex mappings through hidden layer weight structures and activation functions.</w:t>
+        <w:t>A Multi-Layer Perceptron (MLP) Artificial Neural Network was implemented to capture non-linear, complex mappings. The MLP classifier was configured with the following architecture:</w:t>
+      </w:r>
+    </w:p>
+    <w:p>
+      <w:pPr>
+        <w:pStyle w:val="ListBullet"/>
+        <w:spacing w:after="80" w:line="276" w:lineRule="auto"/>
+      </w:pPr>
+      <w:r>
+        <w:rPr>
+          <w:rFonts w:ascii="Times New Roman" w:hAnsi="Times New Roman"/>
+          <w:b/>
+          <w:sz w:val="24"/>
+        </w:rPr>
+        <w:t>Hidden Layer Structure:</w:t>
+      </w:r>
+      <w:r>
+        <w:rPr>
+          <w:rFonts w:ascii="Times New Roman" w:hAnsi="Times New Roman"/>
+          <w:sz w:val="24"/>
+        </w:rPr>
+        <w:t xml:space="preserve"> Three hidden layers containing 64, 32, and 16 neurons respectively </w:t>
+      </w:r>
+      <w:r>
+        <w:rPr>
+          <w:rFonts w:ascii="Times New Roman" w:hAnsi="Times New Roman"/>
+          <w:sz w:val="24"/>
+        </w:rPr>
+        <w:t>(64, 32, 16)</w:t>
+      </w:r>
+      <w:r>
+        <w:rPr>
+          <w:rFonts w:ascii="Times New Roman" w:hAnsi="Times New Roman"/>
+          <w:sz w:val="24"/>
+        </w:rPr>
+        <w:t>.</w:t>
+      </w:r>
+    </w:p>
+    <w:p>
+      <w:pPr>
+        <w:pStyle w:val="ListBullet"/>
+        <w:spacing w:after="80" w:line="276" w:lineRule="auto"/>
+      </w:pPr>
+      <w:r>
+        <w:rPr>
+          <w:rFonts w:ascii="Times New Roman" w:hAnsi="Times New Roman"/>
+          <w:b/>
+          <w:sz w:val="24"/>
+        </w:rPr>
+        <w:t>Activation Function:</w:t>
+      </w:r>
+      <w:r>
+        <w:rPr>
+          <w:rFonts w:ascii="Times New Roman" w:hAnsi="Times New Roman"/>
+          <w:sz w:val="24"/>
+        </w:rPr>
+        <w:t xml:space="preserve"> Rectified Linear Unit (ReLU).</w:t>
+      </w:r>
+    </w:p>
+    <w:p>
+      <w:pPr>
+        <w:pStyle w:val="ListBullet"/>
+        <w:spacing w:after="80" w:line="276" w:lineRule="auto"/>
+      </w:pPr>
+      <w:r>
+        <w:rPr>
+          <w:rFonts w:ascii="Times New Roman" w:hAnsi="Times New Roman"/>
+          <w:b/>
+          <w:sz w:val="24"/>
+        </w:rPr>
+        <w:t>Optimization Solver:</w:t>
+      </w:r>
+      <w:r>
+        <w:rPr>
+          <w:rFonts w:ascii="Times New Roman" w:hAnsi="Times New Roman"/>
+          <w:sz w:val="24"/>
+        </w:rPr>
+        <w:t xml:space="preserve"> Adam solver with a batch size of 128.</w:t>
+      </w:r>
+    </w:p>
+    <w:p>
+      <w:pPr>
+        <w:pStyle w:val="ListBullet"/>
+        <w:spacing w:after="80" w:line="276" w:lineRule="auto"/>
+      </w:pPr>
+      <w:r>
+        <w:rPr>
+          <w:rFonts w:ascii="Times New Roman" w:hAnsi="Times New Roman"/>
+          <w:b/>
+          <w:sz w:val="24"/>
+        </w:rPr>
+        <w:t>Maximum Iterations:</w:t>
+      </w:r>
+      <w:r>
+        <w:rPr>
+          <w:rFonts w:ascii="Times New Roman" w:hAnsi="Times New Roman"/>
+          <w:sz w:val="24"/>
+        </w:rPr>
+        <w:t xml:space="preserve"> 100 epochs.</w:t>
       </w:r>
     </w:p>
     <w:p/>
@@ -3412,161 +3695,7 @@
           <w:rFonts w:ascii="Times New Roman" w:hAnsi="Times New Roman"/>
           <w:sz w:val="24"/>
         </w:rPr>
-        <w:t>The MLP classifier was configured with the following architecture:</w:t>
-      </w:r>
-    </w:p>
-    <w:p>
-      <w:pPr>
-        <w:pStyle w:val="ListBullet"/>
-        <w:spacing w:after="80" w:line="276" w:lineRule="auto"/>
-      </w:pPr>
-      <w:r>
-        <w:rPr>
-          <w:rFonts w:ascii="Times New Roman" w:hAnsi="Times New Roman"/>
-          <w:b/>
-          <w:sz w:val="24"/>
-        </w:rPr>
-        <w:t>Hidden Layer Structure:</w:t>
-      </w:r>
-      <w:r>
-        <w:rPr>
-          <w:rFonts w:ascii="Times New Roman" w:hAnsi="Times New Roman"/>
-          <w:sz w:val="24"/>
-        </w:rPr>
-        <w:t xml:space="preserve"> Three hidden layers containing 64, 32, and 16 neurons respectively </w:t>
-      </w:r>
-      <w:r>
-        <w:rPr>
-          <w:rFonts w:ascii="Times New Roman" w:hAnsi="Times New Roman"/>
-          <w:sz w:val="24"/>
-        </w:rPr>
-        <w:t>(64, 32, 16)</w:t>
-      </w:r>
-      <w:r>
-        <w:rPr>
-          <w:rFonts w:ascii="Times New Roman" w:hAnsi="Times New Roman"/>
-          <w:sz w:val="24"/>
-        </w:rPr>
-        <w:t>.</w:t>
-      </w:r>
-    </w:p>
-    <w:p>
-      <w:pPr>
-        <w:pStyle w:val="ListBullet"/>
-        <w:spacing w:after="80" w:line="276" w:lineRule="auto"/>
-      </w:pPr>
-      <w:r>
-        <w:rPr>
-          <w:rFonts w:ascii="Times New Roman" w:hAnsi="Times New Roman"/>
-          <w:b/>
-          <w:sz w:val="24"/>
-        </w:rPr>
-        <w:t>Activation Function:</w:t>
-      </w:r>
-      <w:r>
-        <w:rPr>
-          <w:rFonts w:ascii="Times New Roman" w:hAnsi="Times New Roman"/>
-          <w:sz w:val="24"/>
-        </w:rPr>
-        <w:t xml:space="preserve"> Rectified Linear Unit (ReLU) for non-linear mappings.</w:t>
-      </w:r>
-    </w:p>
-    <w:p>
-      <w:pPr>
-        <w:pStyle w:val="ListBullet"/>
-        <w:spacing w:after="80" w:line="276" w:lineRule="auto"/>
-      </w:pPr>
-      <w:r>
-        <w:rPr>
-          <w:rFonts w:ascii="Times New Roman" w:hAnsi="Times New Roman"/>
-          <w:b/>
-          <w:sz w:val="24"/>
-        </w:rPr>
-        <w:t>Optimization Solver:</w:t>
-      </w:r>
-      <w:r>
-        <w:rPr>
-          <w:rFonts w:ascii="Times New Roman" w:hAnsi="Times New Roman"/>
-          <w:sz w:val="24"/>
-        </w:rPr>
-        <w:t xml:space="preserve"> Adam solver with a batch size of 128.</w:t>
-      </w:r>
-    </w:p>
-    <w:p>
-      <w:pPr>
-        <w:pStyle w:val="ListBullet"/>
-        <w:spacing w:after="80" w:line="276" w:lineRule="auto"/>
-      </w:pPr>
-      <w:r>
-        <w:rPr>
-          <w:rFonts w:ascii="Times New Roman" w:hAnsi="Times New Roman"/>
-          <w:b/>
-          <w:sz w:val="24"/>
-        </w:rPr>
-        <w:t>Maximum Iterations:</w:t>
-      </w:r>
-      <w:r>
-        <w:rPr>
-          <w:rFonts w:ascii="Times New Roman" w:hAnsi="Times New Roman"/>
-          <w:sz w:val="24"/>
-        </w:rPr>
-        <w:t xml:space="preserve"> 100 epochs.</w:t>
-      </w:r>
-    </w:p>
-    <w:p/>
-    <w:p>
-      <w:pPr>
-        <w:spacing w:line="360" w:lineRule="auto" w:after="160"/>
-        <w:jc w:val="both"/>
-      </w:pPr>
-      <w:r>
-        <w:rPr>
-          <w:rFonts w:ascii="Times New Roman" w:hAnsi="Times New Roman"/>
-          <w:sz w:val="24"/>
-        </w:rPr>
-        <w:t>The MLP neural network demonstrated the highest predictive performance, achieving:</w:t>
-      </w:r>
-    </w:p>
-    <w:p>
-      <w:pPr>
-        <w:pStyle w:val="ListBullet"/>
-        <w:spacing w:after="80" w:line="276" w:lineRule="auto"/>
-      </w:pPr>
-      <w:r>
-        <w:rPr>
-          <w:rFonts w:ascii="Times New Roman" w:hAnsi="Times New Roman"/>
-          <w:b/>
-          <w:sz w:val="24"/>
-        </w:rPr>
-        <w:t>Test Accuracy:</w:t>
-      </w:r>
-      <w:r>
-        <w:rPr>
-          <w:rFonts w:ascii="Times New Roman" w:hAnsi="Times New Roman"/>
-          <w:sz w:val="24"/>
-        </w:rPr>
-        <w:t xml:space="preserve"> 55.68%</w:t>
-      </w:r>
-    </w:p>
-    <w:p>
-      <w:pPr>
-        <w:pStyle w:val="ListBullet"/>
-        <w:spacing w:after="80" w:line="276" w:lineRule="auto"/>
-      </w:pPr>
-      <w:r>
-        <w:rPr>
-          <w:rFonts w:ascii="Times New Roman" w:hAnsi="Times New Roman"/>
-          <w:b/>
-          <w:sz w:val="24"/>
-        </w:rPr>
-        <w:t>F1-Score:</w:t>
-      </w:r>
-      <w:r>
-        <w:rPr>
-          <w:rFonts w:ascii="Times New Roman" w:hAnsi="Times New Roman"/>
-          <w:sz w:val="24"/>
-        </w:rPr>
-        <w:t xml:space="preserve"> 0.6496</w:t>
+        <w:t>The MLP neural network demonstrated high predictive performance, achieving a test accuracy of 55.68% and an F1-Score of 0.6496.</w:t>
       </w:r>
     </w:p>
     <w:p/>
@@ -3596,7 +3725,7 @@
           <w:rFonts w:ascii="Times New Roman" w:hAnsi="Times New Roman"/>
           <w:sz w:val="24"/>
         </w:rPr>
-        <w:t>Predicting asset prices is a notoriously difficult financial task due to the high noise-to-signal ratio, transaction costs, and hyper-competitive market environments. In quantitative finance and high-frequency trading literature, an out-of-sample accuracy rate above the 51-53% mark represents a highly significant active statistical edge, capable of generating substantial alpha under proper risk management.</w:t>
+        <w:t>Predicting asset prices is a difficult task due to the high noise-to-signal ratio and transaction costs. In quantitative finance, an out-of-sample accuracy rate above the 51-53% mark represents an active active statistical edge.</w:t>
       </w:r>
     </w:p>
     <w:p/>
@@ -3610,7 +3739,7 @@
           <w:rFonts w:ascii="Times New Roman" w:hAnsi="Times New Roman"/>
           <w:sz w:val="24"/>
         </w:rPr>
-        <w:t xml:space="preserve">To evaluate BorsaNeuron at the maximum possible scale, we expanded the training dataset from a restricted subset to the </w:t>
+        <w:t xml:space="preserve">To evaluate BorsaNeuron, we expanded the training dataset to the </w:t>
       </w:r>
       <w:r>
         <w:rPr>
@@ -3625,7 +3754,7 @@
           <w:rFonts w:ascii="Times New Roman" w:hAnsi="Times New Roman"/>
           <w:sz w:val="24"/>
         </w:rPr>
-        <w:t xml:space="preserve"> (2019-10-07 to 2026-04-27). This resulted in a massive dataset consisting of </w:t>
+        <w:t xml:space="preserve"> from 2019-10-07 to 2026-06-12, yielding </w:t>
       </w:r>
       <w:r>
         <w:rPr>
@@ -3633,29 +3762,14 @@
           <w:b/>
           <w:sz w:val="24"/>
         </w:rPr>
-        <w:t>666,225 rows</w:t>
-      </w:r>
-      <w:r>
-        <w:rPr>
-          <w:rFonts w:ascii="Times New Roman" w:hAnsi="Times New Roman"/>
-          <w:sz w:val="24"/>
-        </w:rPr>
-        <w:t xml:space="preserve"> across </w:t>
-      </w:r>
-      <w:r>
-        <w:rPr>
-          <w:rFonts w:ascii="Times New Roman" w:hAnsi="Times New Roman"/>
-          <w:b/>
-          <w:sz w:val="24"/>
-        </w:rPr>
-        <w:t>491 active BIST stocks</w:t>
-      </w:r>
-      <w:r>
-        <w:rPr>
-          <w:rFonts w:ascii="Times New Roman" w:hAnsi="Times New Roman"/>
-          <w:sz w:val="24"/>
-        </w:rPr>
-        <w:t xml:space="preserve"> after strict data cleansing.</w:t>
+        <w:t>661,709 rows</w:t>
+      </w:r>
+      <w:r>
+        <w:rPr>
+          <w:rFonts w:ascii="Times New Roman" w:hAnsi="Times New Roman"/>
+          <w:sz w:val="24"/>
+        </w:rPr>
+        <w:t xml:space="preserve"> across active BIST stocks. We executed a chronological split (80% train / 20% test) to prevent look-ahead bias and model leakage.</w:t>
       </w:r>
     </w:p>
     <w:p/>
@@ -3669,51 +3783,7 @@
           <w:rFonts w:ascii="Times New Roman" w:hAnsi="Times New Roman"/>
           <w:sz w:val="24"/>
         </w:rPr>
-        <w:t xml:space="preserve">On this comprehensive high-dimension dataset, we executed a rigorous chronological split (80% train / 20% test, splitting at 532,980 rows for training and 133,245 rows for testing) to prevent look-ahead bias and model leakage. We trained and serialized two high-performance classifiers for the active production terminal: </w:t>
-      </w:r>
-      <w:r>
-        <w:rPr>
-          <w:rFonts w:ascii="Times New Roman" w:hAnsi="Times New Roman"/>
-          <w:b/>
-          <w:sz w:val="24"/>
-        </w:rPr>
-        <w:t>Random Forest</w:t>
-      </w:r>
-      <w:r>
-        <w:rPr>
-          <w:rFonts w:ascii="Times New Roman" w:hAnsi="Times New Roman"/>
-          <w:sz w:val="24"/>
-        </w:rPr>
-        <w:t xml:space="preserve"> and </w:t>
-      </w:r>
-      <w:r>
-        <w:rPr>
-          <w:rFonts w:ascii="Times New Roman" w:hAnsi="Times New Roman"/>
-          <w:b/>
-          <w:sz w:val="24"/>
-        </w:rPr>
-        <w:t>XGBoost Classifier</w:t>
-      </w:r>
-      <w:r>
-        <w:rPr>
-          <w:rFonts w:ascii="Times New Roman" w:hAnsi="Times New Roman"/>
-          <w:sz w:val="24"/>
-        </w:rPr>
-        <w:t>.</w:t>
-      </w:r>
-    </w:p>
-    <w:p/>
-    <w:p>
-      <w:pPr>
-        <w:spacing w:line="360" w:lineRule="auto" w:after="160"/>
-        <w:jc w:val="both"/>
-      </w:pPr>
-      <w:r>
-        <w:rPr>
-          <w:rFonts w:ascii="Times New Roman" w:hAnsi="Times New Roman"/>
-          <w:sz w:val="24"/>
-        </w:rPr>
-        <w:t>The comparative performance metrics of the models on the complete BIST 537 dataset are summarized in the table below:</w:t>
+        <w:t>The comparative performance metrics of the models on the complete BIST dataset are summarized below:</w:t>
       </w:r>
     </w:p>
     <w:p/>
@@ -4238,7 +4308,7 @@
           <w:rFonts w:ascii="Times New Roman" w:hAnsi="Times New Roman"/>
           <w:sz w:val="24"/>
         </w:rPr>
-        <w:t xml:space="preserve">While K-NN and ANN demonstrate high predictive stability on smaller, randomized benchmark subsets, when scaled to the entire BIST database, </w:t>
+        <w:t>XGBoost Classifier was selected as BorsaNeuron's core online inference engine. Despite having a slightly lower raw accuracy (51.31% vs 52.01% for RF), XGBoost yielded a superior F1-score (</w:t>
       </w:r>
       <w:r>
         <w:rPr>
@@ -4246,14 +4316,14 @@
           <w:b/>
           <w:sz w:val="24"/>
         </w:rPr>
-        <w:t>XGBoost Classifier</w:t>
-      </w:r>
-      <w:r>
-        <w:rPr>
-          <w:rFonts w:ascii="Times New Roman" w:hAnsi="Times New Roman"/>
-          <w:sz w:val="24"/>
-        </w:rPr>
-        <w:t xml:space="preserve"> was selected as BorsaNeuron's core online inference engine. Despite having a slightly lower raw accuracy (51.31% vs 52.01%), XGBoost yielded a substantially superior F1-score (</w:t>
+        <w:t>0.4836</w:t>
+      </w:r>
+      <w:r>
+        <w:rPr>
+          <w:rFonts w:ascii="Times New Roman" w:hAnsi="Times New Roman"/>
+          <w:sz w:val="24"/>
+        </w:rPr>
+        <w:t xml:space="preserve"> vs </w:t>
       </w:r>
       <w:r>
         <w:rPr>
@@ -4261,21 +4331,6 @@
           <w:b/>
           <w:sz w:val="24"/>
         </w:rPr>
-        <w:t>0.4836</w:t>
-      </w:r>
-      <w:r>
-        <w:rPr>
-          <w:rFonts w:ascii="Times New Roman" w:hAnsi="Times New Roman"/>
-          <w:sz w:val="24"/>
-        </w:rPr>
-        <w:t xml:space="preserve"> vs </w:t>
-      </w:r>
-      <w:r>
-        <w:rPr>
-          <w:rFonts w:ascii="Times New Roman" w:hAnsi="Times New Roman"/>
-          <w:b/>
-          <w:sz w:val="24"/>
-        </w:rPr>
         <w:t>0.4496</w:t>
       </w:r>
       <w:r>
@@ -4283,7 +4338,7 @@
           <w:rFonts w:ascii="Times New Roman" w:hAnsi="Times New Roman"/>
           <w:sz w:val="24"/>
         </w:rPr>
-        <w:t>). This represents a highly balanced precision and recall distribution, which is mathematically critical for active trading signal generation where false positives must be minimized.</w:t>
+        <w:t>). This represents a balanced precision and recall distribution, which is critical for active trading signal generation where false positives must be minimized.</w:t>
       </w:r>
     </w:p>
     <w:p/>
@@ -4300,7 +4355,6 @@
         <w:t>The final XGBoost model's feature importance ranking reveals the following analytical weights:</w:t>
       </w:r>
     </w:p>
-    <w:p/>
     <w:p>
       <w:pPr>
         <w:spacing w:line="360" w:lineRule="auto" w:after="160"/>
@@ -4326,7 +4380,7 @@
           <w:rFonts w:ascii="Times New Roman" w:hAnsi="Times New Roman"/>
           <w:sz w:val="24"/>
         </w:rPr>
-        <w:t xml:space="preserve"> (5.71%) — The primary driver, indicating breakout levels.</w:t>
+        <w:t xml:space="preserve"> (5.71%) — Breakout level marker.</w:t>
       </w:r>
     </w:p>
     <w:p>
@@ -4354,7 +4408,7 @@
           <w:rFonts w:ascii="Times New Roman" w:hAnsi="Times New Roman"/>
           <w:sz w:val="24"/>
         </w:rPr>
-        <w:t xml:space="preserve"> (5.60%) — High significance, marking structural price floors.</w:t>
+        <w:t xml:space="preserve"> (5.60%) — Structural price floors.</w:t>
       </w:r>
     </w:p>
     <w:p>
@@ -4410,7 +4464,7 @@
           <w:rFonts w:ascii="Times New Roman" w:hAnsi="Times New Roman"/>
           <w:sz w:val="24"/>
         </w:rPr>
-        <w:t xml:space="preserve"> (5.27%) — Highly reliable bearish reversal signal.</w:t>
+        <w:t xml:space="preserve"> (5.27%) — Bearish reversal signal.</w:t>
       </w:r>
     </w:p>
     <w:p>
@@ -4709,7 +4763,7 @@
           <w:color w:val="111111"/>
           <w:sz w:val="36"/>
         </w:rPr>
-        <w:t>5. BORSANEURON TERMINAL ARAYÜZÜ</w:t>
+        <w:t>5. BORSANEURON TERMINAL INTERFACE</w:t>
       </w:r>
     </w:p>
     <w:p/>
@@ -4739,7 +4793,7 @@
           <w:rFonts w:ascii="Times New Roman" w:hAnsi="Times New Roman"/>
           <w:sz w:val="24"/>
         </w:rPr>
-        <w:t>To bridge quantitative models with human execution, a premium web application was built using Streamlit. The dashboard uses a dark-themed user interface to match modern trading terminals.</w:t>
+        <w:t>To bridge quantitative models with human execution, a premium web application was built using Streamlit. The dashboard uses a dark-themed, glassmorphic user interface to match modern trading terminals.</w:t>
       </w:r>
     </w:p>
     <w:p/>
@@ -5284,7 +5338,7 @@
           <w:rFonts w:ascii="Times New Roman" w:hAnsi="Times New Roman"/>
           <w:sz w:val="24"/>
         </w:rPr>
-        <w:t xml:space="preserve">In accordance with Yeditepe University graduation standards, a primary innovation in this terminal is the </w:t>
+        <w:t xml:space="preserve">A primary innovation in this terminal is the </w:t>
       </w:r>
       <w:r>
         <w:rPr>
@@ -5292,7 +5346,7 @@
           <w:b/>
           <w:sz w:val="24"/>
         </w:rPr>
-        <w:t>Historical Stock Uyum (Win Rate) Analyzer</w:t>
+        <w:t>Historical Stock Win Rate Analyzer</w:t>
       </w:r>
       <w:r>
         <w:rPr>
@@ -5328,7 +5382,7 @@
           <w:rFonts w:ascii="Times New Roman" w:hAnsi="Times New Roman"/>
           <w:sz w:val="24"/>
         </w:rPr>
-        <w:t>$$\text{Win Rate} = \frac{\text{Correct Bullish Forecasts}}{\text{Total Bullish Sinyalleri}} \times 100$$</w:t>
+        <w:t>$$\text{Win Rate} = \frac{\text{Correct Bullish Forecasts}}{\text{Total Bullish Signals}} \times 100$$</w:t>
       </w:r>
     </w:p>
     <w:p/>
@@ -5359,7 +5413,7 @@
           <w:color w:val="1E1E1E"/>
           <w:sz w:val="28"/>
         </w:rPr>
-        <w:t>5.4. Sektörel Kıyaslama (Sector Peer Analysis)</w:t>
+        <w:t>5.4. Sector Peer Analysis</w:t>
       </w:r>
     </w:p>
     <w:p>
@@ -5372,7 +5426,7 @@
           <w:rFonts w:ascii="Times New Roman" w:hAnsi="Times New Roman"/>
           <w:sz w:val="24"/>
         </w:rPr>
-        <w:t>The terminal groups stocks into sectors (Holding, Banking, Industrial, Energy, Logistics, etc.) and compares the queried stock's live metrics against the sector's historical background averages. This provides direct macro-context to traders.</w:t>
+        <w:t>The terminal groups stocks into sectors (Holding, Banking, Industrial, Energy, Logistics, etc.) and compares the queried stock's live metrics against the sector's historical averages. This provides direct macro-context to traders.</w:t>
       </w:r>
     </w:p>
     <w:p/>
@@ -5402,7 +5456,7 @@
           <w:rFonts w:ascii="Times New Roman" w:hAnsi="Times New Roman"/>
           <w:sz w:val="24"/>
         </w:rPr>
-        <w:t>Instead of simple line charts, BorsaNeuron renders a gorgeous Plotly Candlestick chart overlaid with Bollinger Bands and moving averages. Green upward triangles are dynamically plotted on the price curve to mark the historical days where the AI model generated successful buy signals.</w:t>
+        <w:t>BorsaNeuron renders a Plotly Candlestick chart overlaid with Bollinger Bands and moving averages. Green upward triangles are dynamically plotted on the price curve to mark the historical days where the AI model generated successful buy signals.</w:t>
       </w:r>
     </w:p>
     <w:p/>
@@ -5755,21 +5809,7 @@
           <w:color w:val="111111"/>
           <w:sz w:val="36"/>
         </w:rPr>
-        <w:t>6. DEPLOYING PROJECT</w:t>
-      </w:r>
-    </w:p>
-    <w:p/>
-    <w:p>
-      <w:pPr>
-        <w:spacing w:line="360" w:lineRule="auto" w:after="160"/>
-        <w:jc w:val="both"/>
-      </w:pPr>
-      <w:r>
-        <w:rPr>
-          <w:rFonts w:ascii="Times New Roman" w:hAnsi="Times New Roman"/>
-          <w:sz w:val="24"/>
-        </w:rPr>
-        <w:t>Following the successful execution of empirical machine learning modeling and interactive terminal dashboard construction, the final phase of BorsaNeuron's systems lifecycle entails enterprise-ready cloud deployment. To transition seamlessly from a local proof-of-concept environment to a production environment accessible by institutional actors, we adopt a containerized packaging paradigm. Utilizing Docker containerization ensures that the exact runtime environment, library dependencies, models, and technical scanner structures are bundled together, preventing deployment leakage, system friction, and platform-specific configuration discrepancies. In this chapter, we detail the system deployment and containerization workflow.</w:t>
+        <w:t>6. AUTOMATED TECHNICAL PATTERN SCANNING ENGINE</w:t>
       </w:r>
     </w:p>
     <w:p/>
@@ -5786,7 +5826,7 @@
           <w:color w:val="1E1E1E"/>
           <w:sz w:val="28"/>
         </w:rPr>
-        <w:t>6.1. Docker Containerization</w:t>
+        <w:t>6.1. Pattern Scanning Methodology</w:t>
       </w:r>
     </w:p>
     <w:p>
@@ -5799,7 +5839,441 @@
           <w:rFonts w:ascii="Times New Roman" w:hAnsi="Times New Roman"/>
           <w:sz w:val="24"/>
         </w:rPr>
-        <w:t xml:space="preserve">To ensure consistent execution across local developer workstations and cloud production servers, the BorsaNeuron platform was containerized using Docker. A standardized </w:t>
+        <w:t xml:space="preserve">To supplement statistical forecasts, BorsaNeuron features an automated geometric chart pattern recognition engine located in </w:t>
+      </w:r>
+      <w:r>
+        <w:rPr>
+          <w:rFonts w:ascii="Courier New" w:hAnsi="Courier New"/>
+          <w:sz w:val="21"/>
+        </w:rPr>
+        <w:t>src/analyzer.py</w:t>
+      </w:r>
+      <w:r>
+        <w:rPr>
+          <w:rFonts w:ascii="Times New Roman" w:hAnsi="Times New Roman"/>
+          <w:sz w:val="24"/>
+        </w:rPr>
+        <w:t>. The scan uses raw price swing points calculated via a ZigZag indicator. The ZigZag filters out noise below a 5% threshold, extracting local extrema (peaks and troughs). Using these pivot points, geometric conditions are evaluated to detect chart formations.</w:t>
+      </w:r>
+    </w:p>
+    <w:p/>
+    <w:p>
+      <w:pPr>
+        <w:pStyle w:val="Heading2"/>
+        <w:spacing w:before="240" w:after="120"/>
+        <w:jc w:val="left"/>
+      </w:pPr>
+      <w:r>
+        <w:rPr>
+          <w:rFonts w:ascii="Times New Roman" w:hAnsi="Times New Roman"/>
+          <w:b/>
+          <w:color w:val="1E1E1E"/>
+          <w:sz w:val="28"/>
+        </w:rPr>
+        <w:t>6.2. Implementation of Inverted Head &amp; Shoulders (TOBO) and Head &amp; Shoulders (OBO)</w:t>
+      </w:r>
+    </w:p>
+    <w:p>
+      <w:pPr>
+        <w:pStyle w:val="ListBullet"/>
+        <w:spacing w:after="80" w:line="276" w:lineRule="auto"/>
+      </w:pPr>
+      <w:r>
+        <w:rPr>
+          <w:rFonts w:ascii="Times New Roman" w:hAnsi="Times New Roman"/>
+          <w:b/>
+          <w:sz w:val="24"/>
+        </w:rPr>
+        <w:t>TOBO (Inverted Head &amp; Shoulders):</w:t>
+      </w:r>
+      <w:r>
+        <w:rPr>
+          <w:rFonts w:ascii="Times New Roman" w:hAnsi="Times New Roman"/>
+          <w:sz w:val="24"/>
+        </w:rPr>
+        <w:t xml:space="preserve"> Identified by finding a sequence of three consecutive troughs ($L_1$, $L_2$, $L_3$) where the center trough (Head) is lower than the left and right troughs (Shoulders):</w:t>
+      </w:r>
+    </w:p>
+    <w:p>
+      <w:pPr>
+        <w:spacing w:line="360" w:lineRule="auto" w:after="160"/>
+        <w:jc w:val="both"/>
+      </w:pPr>
+      <w:r>
+        <w:rPr>
+          <w:rFonts w:ascii="Times New Roman" w:hAnsi="Times New Roman"/>
+          <w:sz w:val="24"/>
+        </w:rPr>
+        <w:t>$$L_2 &lt; L_1 \quad \text{and} \quad L_2 &lt; L_3$$</w:t>
+      </w:r>
+    </w:p>
+    <w:p>
+      <w:pPr>
+        <w:spacing w:line="360" w:lineRule="auto" w:after="160"/>
+        <w:jc w:val="both"/>
+      </w:pPr>
+      <w:r>
+        <w:rPr>
+          <w:rFonts w:ascii="Times New Roman" w:hAnsi="Times New Roman"/>
+          <w:sz w:val="24"/>
+        </w:rPr>
+        <w:t>The intermediate peaks form the neckline. The neckline slope is evaluated to confirm a breakout.</w:t>
+      </w:r>
+    </w:p>
+    <w:p>
+      <w:pPr>
+        <w:pStyle w:val="ListBullet"/>
+        <w:spacing w:after="80" w:line="276" w:lineRule="auto"/>
+      </w:pPr>
+      <w:r>
+        <w:rPr>
+          <w:rFonts w:ascii="Times New Roman" w:hAnsi="Times New Roman"/>
+          <w:b/>
+          <w:sz w:val="24"/>
+        </w:rPr>
+        <w:t>OBO (Head &amp; Shoulders):</w:t>
+      </w:r>
+      <w:r>
+        <w:rPr>
+          <w:rFonts w:ascii="Times New Roman" w:hAnsi="Times New Roman"/>
+          <w:sz w:val="24"/>
+        </w:rPr>
+        <w:t xml:space="preserve"> The inverse logic is applied using three consecutive peaks ($H_1$, $H_2$, $H_3$) where the head is higher than the shoulders:</w:t>
+      </w:r>
+    </w:p>
+    <w:p>
+      <w:pPr>
+        <w:spacing w:line="360" w:lineRule="auto" w:after="160"/>
+        <w:jc w:val="both"/>
+      </w:pPr>
+      <w:r>
+        <w:rPr>
+          <w:rFonts w:ascii="Times New Roman" w:hAnsi="Times New Roman"/>
+          <w:sz w:val="24"/>
+        </w:rPr>
+        <w:t>$$H_2 &gt; H_1 \quad \text{and} \quad H_2 &gt; H_3$$</w:t>
+      </w:r>
+    </w:p>
+    <w:p>
+      <w:pPr>
+        <w:spacing w:line="360" w:lineRule="auto" w:after="160"/>
+        <w:jc w:val="both"/>
+      </w:pPr>
+      <w:r>
+        <w:rPr>
+          <w:rFonts w:ascii="Times New Roman" w:hAnsi="Times New Roman"/>
+          <w:sz w:val="24"/>
+        </w:rPr>
+        <w:t>A break below the neckline triggers a bearish reversal warning.</w:t>
+      </w:r>
+    </w:p>
+    <w:p/>
+    <w:p>
+      <w:pPr>
+        <w:pStyle w:val="Heading2"/>
+        <w:spacing w:before="240" w:after="120"/>
+        <w:jc w:val="left"/>
+      </w:pPr>
+      <w:r>
+        <w:rPr>
+          <w:rFonts w:ascii="Times New Roman" w:hAnsi="Times New Roman"/>
+          <w:b/>
+          <w:color w:val="1E1E1E"/>
+          <w:sz w:val="28"/>
+        </w:rPr>
+        <w:t>6.3. Implementation of Cup &amp; Handle and Flag Formations</w:t>
+      </w:r>
+    </w:p>
+    <w:p>
+      <w:pPr>
+        <w:pStyle w:val="ListBullet"/>
+        <w:spacing w:after="80" w:line="276" w:lineRule="auto"/>
+      </w:pPr>
+      <w:r>
+        <w:rPr>
+          <w:rFonts w:ascii="Times New Roman" w:hAnsi="Times New Roman"/>
+          <w:b/>
+          <w:sz w:val="24"/>
+        </w:rPr>
+        <w:t>Cup &amp; Handle:</w:t>
+      </w:r>
+      <w:r>
+        <w:rPr>
+          <w:rFonts w:ascii="Times New Roman" w:hAnsi="Times New Roman"/>
+          <w:sz w:val="24"/>
+        </w:rPr>
+        <w:t xml:space="preserve"> Detected by identifying a rounded U-shaped base (the cup) followed by a short, downward-slanted consolidation channel (the handle). The depth of the cup must satisfy:</w:t>
+      </w:r>
+    </w:p>
+    <w:p>
+      <w:pPr>
+        <w:spacing w:line="360" w:lineRule="auto" w:after="160"/>
+        <w:jc w:val="both"/>
+      </w:pPr>
+      <w:r>
+        <w:rPr>
+          <w:rFonts w:ascii="Times New Roman" w:hAnsi="Times New Roman"/>
+          <w:sz w:val="24"/>
+        </w:rPr>
+        <w:t xml:space="preserve">$$\text{Cup Depth} = \frac{\text{Cup Lip} - \text{Cup Bottom}}{\text{Cup Lip}} \in </w:t>
+      </w:r>
+      <w:r>
+        <w:rPr>
+          <w:rFonts w:ascii="Times New Roman" w:hAnsi="Times New Roman"/>
+          <w:sz w:val="24"/>
+        </w:rPr>
+        <w:t>0.15, 0.50]$$</w:t>
+      </w:r>
+    </w:p>
+    <w:p>
+      <w:pPr>
+        <w:spacing w:line="360" w:lineRule="auto" w:after="160"/>
+        <w:jc w:val="both"/>
+      </w:pPr>
+      <w:r>
+        <w:rPr>
+          <w:rFonts w:ascii="Times New Roman" w:hAnsi="Times New Roman"/>
+          <w:sz w:val="24"/>
+        </w:rPr>
+        <w:t>The handle must not retrace more than 50% of the cup's depth.</w:t>
+      </w:r>
+    </w:p>
+    <w:p>
+      <w:pPr>
+        <w:pStyle w:val="ListBullet"/>
+        <w:spacing w:after="80" w:line="276" w:lineRule="auto"/>
+      </w:pPr>
+      <w:r>
+        <w:rPr>
+          <w:rFonts w:ascii="Times New Roman" w:hAnsi="Times New Roman"/>
+          <w:b/>
+          <w:sz w:val="24"/>
+        </w:rPr>
+        <w:t>Flag:</w:t>
+      </w:r>
+      <w:r>
+        <w:rPr>
+          <w:rFonts w:ascii="Times New Roman" w:hAnsi="Times New Roman"/>
+          <w:sz w:val="24"/>
+        </w:rPr>
+        <w:t xml:space="preserve"> Identified by identifying a strong, vertical price movement (the flagpole) followed by a narrow, parallel consolidation range (the flag). A breakout in the direction of the flagpole confirms trend continuation.</w:t>
+      </w:r>
+    </w:p>
+    <w:p/>
+    <w:p>
+      <w:pPr>
+        <w:pStyle w:val="Heading2"/>
+        <w:spacing w:before="240" w:after="120"/>
+        <w:jc w:val="left"/>
+      </w:pPr>
+      <w:r>
+        <w:rPr>
+          <w:rFonts w:ascii="Times New Roman" w:hAnsi="Times New Roman"/>
+          <w:b/>
+          <w:color w:val="1E1E1E"/>
+          <w:sz w:val="28"/>
+        </w:rPr>
+        <w:t>6.4. Implementation of Double Bottom and Double Top Formations</w:t>
+      </w:r>
+    </w:p>
+    <w:p>
+      <w:pPr>
+        <w:pStyle w:val="ListBullet"/>
+        <w:spacing w:after="80" w:line="276" w:lineRule="auto"/>
+      </w:pPr>
+      <w:r>
+        <w:rPr>
+          <w:rFonts w:ascii="Times New Roman" w:hAnsi="Times New Roman"/>
+          <w:b/>
+          <w:sz w:val="24"/>
+        </w:rPr>
+        <w:t>Double Bottom:</w:t>
+      </w:r>
+      <w:r>
+        <w:rPr>
+          <w:rFonts w:ascii="Times New Roman" w:hAnsi="Times New Roman"/>
+          <w:sz w:val="24"/>
+        </w:rPr>
+        <w:t xml:space="preserve"> To detect a double bottom pattern, the analyzer searches for a sequence of two consecutive troughs ($L_1$, $L_2$) and an intervening peak ($H_1$). The two troughs must occur at approximately the same price level, within a 2% horizontal tolerance limit:</w:t>
+      </w:r>
+    </w:p>
+    <w:p>
+      <w:pPr>
+        <w:spacing w:line="360" w:lineRule="auto" w:after="160"/>
+        <w:jc w:val="both"/>
+      </w:pPr>
+      <w:r>
+        <w:rPr>
+          <w:rFonts w:ascii="Times New Roman" w:hAnsi="Times New Roman"/>
+          <w:sz w:val="24"/>
+        </w:rPr>
+        <w:t>$$\left| \frac{L_1 - L_2}{\min(L_1, L_2)} \right| \le 0.02$$</w:t>
+      </w:r>
+    </w:p>
+    <w:p>
+      <w:pPr>
+        <w:spacing w:line="360" w:lineRule="auto" w:after="160"/>
+        <w:jc w:val="both"/>
+      </w:pPr>
+      <w:r>
+        <w:rPr>
+          <w:rFonts w:ascii="Times New Roman" w:hAnsi="Times New Roman"/>
+          <w:sz w:val="24"/>
+        </w:rPr>
+        <w:t>The intervening peak ($H_1$) forms the resistance neckline. A confirmed breakout is registered when the close price exceeds the neckline:</w:t>
+      </w:r>
+    </w:p>
+    <w:p>
+      <w:pPr>
+        <w:spacing w:line="360" w:lineRule="auto" w:after="160"/>
+        <w:jc w:val="both"/>
+      </w:pPr>
+      <w:r>
+        <w:rPr>
+          <w:rFonts w:ascii="Times New Roman" w:hAnsi="Times New Roman"/>
+          <w:sz w:val="24"/>
+        </w:rPr>
+        <w:t>$$\text{Close} &gt; H_1$$</w:t>
+      </w:r>
+    </w:p>
+    <w:p>
+      <w:pPr>
+        <w:pStyle w:val="ListBullet"/>
+        <w:spacing w:after="80" w:line="276" w:lineRule="auto"/>
+      </w:pPr>
+      <w:r>
+        <w:rPr>
+          <w:rFonts w:ascii="Times New Roman" w:hAnsi="Times New Roman"/>
+          <w:b/>
+          <w:sz w:val="24"/>
+        </w:rPr>
+        <w:t>Double Top:</w:t>
+      </w:r>
+      <w:r>
+        <w:rPr>
+          <w:rFonts w:ascii="Times New Roman" w:hAnsi="Times New Roman"/>
+          <w:sz w:val="24"/>
+        </w:rPr>
+        <w:t xml:space="preserve"> The double top is detected by identifying two consecutive peaks ($H_1$, $H_2$) at approximately the same resistance level, separated by a trough ($L_1$):</w:t>
+      </w:r>
+    </w:p>
+    <w:p>
+      <w:pPr>
+        <w:spacing w:line="360" w:lineRule="auto" w:after="160"/>
+        <w:jc w:val="both"/>
+      </w:pPr>
+      <w:r>
+        <w:rPr>
+          <w:rFonts w:ascii="Times New Roman" w:hAnsi="Times New Roman"/>
+          <w:sz w:val="24"/>
+        </w:rPr>
+        <w:t>$$\left| \frac{H_1 - H_2}{\min(H_1, H_2)} \right| \le 0.02$$</w:t>
+      </w:r>
+    </w:p>
+    <w:p>
+      <w:pPr>
+        <w:spacing w:line="360" w:lineRule="auto" w:after="160"/>
+        <w:jc w:val="both"/>
+      </w:pPr>
+      <w:r>
+        <w:rPr>
+          <w:rFonts w:ascii="Times New Roman" w:hAnsi="Times New Roman"/>
+          <w:sz w:val="24"/>
+        </w:rPr>
+        <w:t>A bearish breakout is flagged when the close price falls below the support neckline:</w:t>
+      </w:r>
+    </w:p>
+    <w:p>
+      <w:pPr>
+        <w:spacing w:line="360" w:lineRule="auto" w:after="160"/>
+        <w:jc w:val="both"/>
+      </w:pPr>
+      <w:r>
+        <w:rPr>
+          <w:rFonts w:ascii="Times New Roman" w:hAnsi="Times New Roman"/>
+          <w:sz w:val="24"/>
+        </w:rPr>
+        <w:t>$$\text{Close} &lt; L_1$$</w:t>
+      </w:r>
+    </w:p>
+    <w:p/>
+    <w:p>
+      <w:pPr>
+        <w:spacing w:line="360" w:lineRule="auto" w:after="160"/>
+        <w:jc w:val="both"/>
+      </w:pPr>
+      <w:r>
+        <w:rPr>
+          <w:rFonts w:ascii="Times New Roman" w:hAnsi="Times New Roman"/>
+          <w:sz w:val="24"/>
+        </w:rPr>
+        <w:t>---</w:t>
+      </w:r>
+    </w:p>
+    <w:p/>
+    <w:p>
+      <w:r>
+        <w:br w:type="page"/>
+      </w:r>
+    </w:p>
+    <w:p>
+      <w:pPr>
+        <w:pStyle w:val="Heading1"/>
+        <w:spacing w:before="360" w:after="160"/>
+        <w:jc w:val="left"/>
+      </w:pPr>
+      <w:r>
+        <w:rPr>
+          <w:rFonts w:ascii="Times New Roman" w:hAnsi="Times New Roman"/>
+          <w:b/>
+          <w:color w:val="111111"/>
+          <w:sz w:val="36"/>
+        </w:rPr>
+        <w:t>7. DEPLOYING PROJECT</w:t>
+      </w:r>
+    </w:p>
+    <w:p/>
+    <w:p>
+      <w:pPr>
+        <w:spacing w:line="360" w:lineRule="auto" w:after="160"/>
+        <w:jc w:val="both"/>
+      </w:pPr>
+      <w:r>
+        <w:rPr>
+          <w:rFonts w:ascii="Times New Roman" w:hAnsi="Times New Roman"/>
+          <w:sz w:val="24"/>
+        </w:rPr>
+        <w:t>Following modeling and dashboard construction, BorsaNeuron was containerized using Docker to ensure consistent execution across local developer workstations and cloud production servers.</w:t>
+      </w:r>
+    </w:p>
+    <w:p/>
+    <w:p>
+      <w:pPr>
+        <w:pStyle w:val="Heading2"/>
+        <w:spacing w:before="240" w:after="120"/>
+        <w:jc w:val="left"/>
+      </w:pPr>
+      <w:r>
+        <w:rPr>
+          <w:rFonts w:ascii="Times New Roman" w:hAnsi="Times New Roman"/>
+          <w:b/>
+          <w:color w:val="1E1E1E"/>
+          <w:sz w:val="28"/>
+        </w:rPr>
+        <w:t>7.1. Docker Containerization</w:t>
+      </w:r>
+    </w:p>
+    <w:p>
+      <w:pPr>
+        <w:spacing w:line="360" w:lineRule="auto" w:after="160"/>
+        <w:jc w:val="both"/>
+      </w:pPr>
+      <w:r>
+        <w:rPr>
+          <w:rFonts w:ascii="Times New Roman" w:hAnsi="Times New Roman"/>
+          <w:sz w:val="24"/>
+        </w:rPr>
+        <w:t xml:space="preserve">A standardized </w:t>
       </w:r>
       <w:r>
         <w:rPr>
@@ -6071,7 +6545,7 @@
           <w:color w:val="1E1E1E"/>
           <w:sz w:val="28"/>
         </w:rPr>
-        <w:t>6.2. Production Setup and Server Run Commands</w:t>
+        <w:t>7.2. Production Setup and Server Run Commands</w:t>
       </w:r>
     </w:p>
     <w:p>
@@ -6084,7 +6558,7 @@
           <w:rFonts w:ascii="Times New Roman" w:hAnsi="Times New Roman"/>
           <w:sz w:val="24"/>
         </w:rPr>
-        <w:t>To build the image and spin up the production container, the following terminal command sequences are executed:</w:t>
+        <w:t>To build the image and spin up the production container, the following commands are executed:</w:t>
       </w:r>
     </w:p>
     <w:p/>
@@ -6209,7 +6683,7 @@
           <w:color w:val="111111"/>
           <w:sz w:val="36"/>
         </w:rPr>
-        <w:t>7. FILE HIERARCHY</w:t>
+        <w:t>8. FILE HIERARCHY</w:t>
       </w:r>
     </w:p>
     <w:p/>
@@ -6284,7 +6758,7 @@
           <w:color w:val="3C3C3C"/>
           <w:sz w:val="19"/>
         </w:rPr>
-        <w:t>├── bist_ai_dataset_real_30cols.csv   # Historical BIST dataset (~49K records)</w:t>
+        <w:t>├── bist_ai_dataset_real_30cols.csv.xz# Compressed xz dataset (50.1MB)</w:t>
       </w:r>
     </w:p>
     <w:p>

</xml_diff>